<commit_message>
Feat: Algoritmus Docx kész, PDF feltöltve
</commit_message>
<xml_diff>
--- a/docs/folyamatÁbrák/Corelytics folyamtábrák.docx
+++ b/docs/folyamatÁbrák/Corelytics folyamtábrák.docx
@@ -1,6 +1,6 @@
 
 <file path=word/document.xml><?xml version="1.0" encoding="utf-8"?>
-<w:document xmlns:wpc="http://schemas.microsoft.com/office/word/2010/wordprocessingCanvas" xmlns:cx="http://schemas.microsoft.com/office/drawing/2014/chartex" xmlns:cx1="http://schemas.microsoft.com/office/drawing/2015/9/8/chartex" xmlns:cx2="http://schemas.microsoft.com/office/drawing/2015/10/21/chartex" xmlns:cx3="http://schemas.microsoft.com/office/drawing/2016/5/9/chartex" xmlns:cx4="http://schemas.microsoft.com/office/drawing/2016/5/10/chartex" xmlns:cx5="http://schemas.microsoft.com/office/drawing/2016/5/11/chartex" xmlns:cx6="http://schemas.microsoft.com/office/drawing/2016/5/12/chartex" xmlns:cx7="http://schemas.microsoft.com/office/drawing/2016/5/13/chartex" xmlns:cx8="http://schemas.microsoft.com/office/drawing/2016/5/14/chartex" xmlns:mc="http://schemas.openxmlformats.org/markup-compatibility/2006" xmlns:aink="http://schemas.microsoft.com/office/drawing/2016/ink" xmlns:am3d="http://schemas.microsoft.com/office/drawing/2017/model3d" xmlns:o="urn:schemas-microsoft-com:office:office" xmlns:oel="http://schemas.microsoft.com/office/2019/extlst" xmlns:r="http://schemas.openxmlformats.org/officeDocument/2006/relationships" xmlns:m="http://schemas.openxmlformats.org/officeDocument/2006/math" xmlns:v="urn:schemas-microsoft-com:vml" xmlns:wp14="http://schemas.microsoft.com/office/word/2010/wordprocessingDrawing" xmlns:wp="http://schemas.openxmlformats.org/drawingml/2006/wordprocessingDrawing" xmlns:w10="urn:schemas-microsoft-com:office:word" xmlns:w="http://schemas.openxmlformats.org/wordprocessingml/2006/main" xmlns:w14="http://schemas.microsoft.com/office/word/2010/wordml" xmlns:w15="http://schemas.microsoft.com/office/word/2012/wordml" xmlns:w16cex="http://schemas.microsoft.com/office/word/2018/wordml/cex" xmlns:w16cid="http://schemas.microsoft.com/office/word/2016/wordml/cid" xmlns:w16="http://schemas.microsoft.com/office/word/2018/wordml" xmlns:w16du="http://schemas.microsoft.com/office/word/2023/wordml/word16du" xmlns:w16sdtdh="http://schemas.microsoft.com/office/word/2020/wordml/sdtdatahash" xmlns:w16sdtfl="http://schemas.microsoft.com/office/word/2024/wordml/sdtformatlock" xmlns:w16se="http://schemas.microsoft.com/office/word/2015/wordml/symex" xmlns:wpg="http://schemas.microsoft.com/office/word/2010/wordprocessingGroup" xmlns:wpi="http://schemas.microsoft.com/office/word/2010/wordprocessingInk" xmlns:wne="http://schemas.microsoft.com/office/word/2006/wordml" xmlns:wps="http://schemas.microsoft.com/office/word/2010/wordprocessingShape" mc:Ignorable="w14 w15 w16se w16cid w16 w16cex w16sdtdh w16sdtfl w16du wp14">
+<w:document xmlns:wpc="http://schemas.microsoft.com/office/word/2010/wordprocessingCanvas" xmlns:cx="http://schemas.microsoft.com/office/drawing/2014/chartex" xmlns:cx1="http://schemas.microsoft.com/office/drawing/2015/9/8/chartex" xmlns:cx2="http://schemas.microsoft.com/office/drawing/2015/10/21/chartex" xmlns:cx3="http://schemas.microsoft.com/office/drawing/2016/5/9/chartex" xmlns:cx4="http://schemas.microsoft.com/office/drawing/2016/5/10/chartex" xmlns:cx5="http://schemas.microsoft.com/office/drawing/2016/5/11/chartex" xmlns:cx6="http://schemas.microsoft.com/office/drawing/2016/5/12/chartex" xmlns:cx7="http://schemas.microsoft.com/office/drawing/2016/5/13/chartex" xmlns:cx8="http://schemas.microsoft.com/office/drawing/2016/5/14/chartex" xmlns:mc="http://schemas.openxmlformats.org/markup-compatibility/2006" xmlns:aink="http://schemas.microsoft.com/office/drawing/2016/ink" xmlns:am3d="http://schemas.microsoft.com/office/drawing/2017/model3d" xmlns:o="urn:schemas-microsoft-com:office:office" xmlns:r="http://schemas.openxmlformats.org/officeDocument/2006/relationships" xmlns:m="http://schemas.openxmlformats.org/officeDocument/2006/math" xmlns:v="urn:schemas-microsoft-com:vml" xmlns:wp14="http://schemas.microsoft.com/office/word/2010/wordprocessingDrawing" xmlns:wp="http://schemas.openxmlformats.org/drawingml/2006/wordprocessingDrawing" xmlns:w10="urn:schemas-microsoft-com:office:word" xmlns:w="http://schemas.openxmlformats.org/wordprocessingml/2006/main" xmlns:w14="http://schemas.microsoft.com/office/word/2010/wordml" xmlns:w15="http://schemas.microsoft.com/office/word/2012/wordml" xmlns:w16cex="http://schemas.microsoft.com/office/word/2018/wordml/cex" xmlns:w16cid="http://schemas.microsoft.com/office/word/2016/wordml/cid" xmlns:w16="http://schemas.microsoft.com/office/word/2018/wordml" xmlns:w16sdtdh="http://schemas.microsoft.com/office/word/2020/wordml/sdtdatahash" xmlns:w16se="http://schemas.microsoft.com/office/word/2015/wordml/symex" xmlns:wpg="http://schemas.microsoft.com/office/word/2010/wordprocessingGroup" xmlns:wpi="http://schemas.microsoft.com/office/word/2010/wordprocessingInk" xmlns:wne="http://schemas.microsoft.com/office/word/2006/wordml" xmlns:wps="http://schemas.microsoft.com/office/word/2010/wordprocessingShape" mc:Ignorable="w14 w15 w16se w16cid w16 w16cex w16sdtdh wp14">
   <w:body>
     <w:p>
       <w:pPr>
@@ -112,7 +112,22 @@
           <w:szCs w:val="24"/>
         </w:rPr>
         <w:tab/>
-        <w:t>Gubek-Szabó Tamás 13.I</w:t>
+      </w:r>
+      <w:proofErr w:type="spellStart"/>
+      <w:r>
+        <w:rPr>
+          <w:sz w:val="24"/>
+          <w:szCs w:val="24"/>
+        </w:rPr>
+        <w:t>Gubek</w:t>
+      </w:r>
+      <w:proofErr w:type="spellEnd"/>
+      <w:r>
+        <w:rPr>
+          <w:sz w:val="24"/>
+          <w:szCs w:val="24"/>
+        </w:rPr>
+        <w:t>-Szabó Tamás 13.I</w:t>
       </w:r>
     </w:p>
     <w:p>
@@ -209,7 +224,7 @@
             </w:rPr>
             <w:fldChar w:fldCharType="separate"/>
           </w:r>
-          <w:hyperlink w:anchor="_Toc214433394" w:history="1">
+          <w:hyperlink w:anchor="_Toc214949271" w:history="1">
             <w:r>
               <w:rPr>
                 <w:rStyle w:val="Hiperhivatkozs"/>
@@ -236,7 +251,7 @@
                 <w:noProof/>
                 <w:webHidden/>
               </w:rPr>
-              <w:instrText xml:space="preserve"> PAGEREF _Toc214433394 \h </w:instrText>
+              <w:instrText xml:space="preserve"> PAGEREF _Toc214949271 \h </w:instrText>
             </w:r>
             <w:r>
               <w:rPr>
@@ -279,7 +294,7 @@
               <w:lang w:eastAsia="hu-HU"/>
             </w:rPr>
           </w:pPr>
-          <w:hyperlink w:anchor="_Toc214433395" w:history="1">
+          <w:hyperlink w:anchor="_Toc214949272" w:history="1">
             <w:r>
               <w:rPr>
                 <w:rStyle w:val="Hiperhivatkozs"/>
@@ -306,7 +321,7 @@
                 <w:noProof/>
                 <w:webHidden/>
               </w:rPr>
-              <w:instrText xml:space="preserve"> PAGEREF _Toc214433395 \h </w:instrText>
+              <w:instrText xml:space="preserve"> PAGEREF _Toc214949272 \h </w:instrText>
             </w:r>
             <w:r>
               <w:rPr>
@@ -349,7 +364,7 @@
               <w:lang w:eastAsia="hu-HU"/>
             </w:rPr>
           </w:pPr>
-          <w:hyperlink w:anchor="_Toc214433396" w:history="1">
+          <w:hyperlink w:anchor="_Toc214949273" w:history="1">
             <w:r>
               <w:rPr>
                 <w:rStyle w:val="Hiperhivatkozs"/>
@@ -376,7 +391,7 @@
                 <w:noProof/>
                 <w:webHidden/>
               </w:rPr>
-              <w:instrText xml:space="preserve"> PAGEREF _Toc214433396 \h </w:instrText>
+              <w:instrText xml:space="preserve"> PAGEREF _Toc214949273 \h </w:instrText>
             </w:r>
             <w:r>
               <w:rPr>
@@ -419,7 +434,7 @@
               <w:lang w:eastAsia="hu-HU"/>
             </w:rPr>
           </w:pPr>
-          <w:hyperlink w:anchor="_Toc214433397" w:history="1">
+          <w:hyperlink w:anchor="_Toc214949274" w:history="1">
             <w:r>
               <w:rPr>
                 <w:rStyle w:val="Hiperhivatkozs"/>
@@ -446,7 +461,7 @@
                 <w:noProof/>
                 <w:webHidden/>
               </w:rPr>
-              <w:instrText xml:space="preserve"> PAGEREF _Toc214433397 \h </w:instrText>
+              <w:instrText xml:space="preserve"> PAGEREF _Toc214949274 \h </w:instrText>
             </w:r>
             <w:r>
               <w:rPr>
@@ -467,6 +482,426 @@
                 <w:webHidden/>
               </w:rPr>
               <w:t>- 3 -</w:t>
+            </w:r>
+            <w:r>
+              <w:rPr>
+                <w:noProof/>
+                <w:webHidden/>
+              </w:rPr>
+              <w:fldChar w:fldCharType="end"/>
+            </w:r>
+          </w:hyperlink>
+        </w:p>
+        <w:p>
+          <w:pPr>
+            <w:pStyle w:val="TJ1"/>
+            <w:tabs>
+              <w:tab w:val="right" w:leader="dot" w:pos="9062"/>
+            </w:tabs>
+            <w:rPr>
+              <w:rFonts w:eastAsiaTheme="minorEastAsia"/>
+              <w:noProof/>
+              <w:lang w:eastAsia="hu-HU"/>
+            </w:rPr>
+          </w:pPr>
+          <w:hyperlink w:anchor="_Toc214949275" w:history="1">
+            <w:r>
+              <w:rPr>
+                <w:rStyle w:val="Hiperhivatkozs"/>
+                <w:noProof/>
+              </w:rPr>
+              <w:t>3. Tápanyagszámítás folyamatábrája</w:t>
+            </w:r>
+            <w:r>
+              <w:rPr>
+                <w:noProof/>
+                <w:webHidden/>
+              </w:rPr>
+              <w:tab/>
+            </w:r>
+            <w:r>
+              <w:rPr>
+                <w:noProof/>
+                <w:webHidden/>
+              </w:rPr>
+              <w:fldChar w:fldCharType="begin"/>
+            </w:r>
+            <w:r>
+              <w:rPr>
+                <w:noProof/>
+                <w:webHidden/>
+              </w:rPr>
+              <w:instrText xml:space="preserve"> PAGEREF _Toc214949275 \h </w:instrText>
+            </w:r>
+            <w:r>
+              <w:rPr>
+                <w:noProof/>
+                <w:webHidden/>
+              </w:rPr>
+            </w:r>
+            <w:r>
+              <w:rPr>
+                <w:noProof/>
+                <w:webHidden/>
+              </w:rPr>
+              <w:fldChar w:fldCharType="separate"/>
+            </w:r>
+            <w:r>
+              <w:rPr>
+                <w:noProof/>
+                <w:webHidden/>
+              </w:rPr>
+              <w:t>- 4 -</w:t>
+            </w:r>
+            <w:r>
+              <w:rPr>
+                <w:noProof/>
+                <w:webHidden/>
+              </w:rPr>
+              <w:fldChar w:fldCharType="end"/>
+            </w:r>
+          </w:hyperlink>
+        </w:p>
+        <w:p>
+          <w:pPr>
+            <w:pStyle w:val="TJ2"/>
+            <w:tabs>
+              <w:tab w:val="right" w:leader="dot" w:pos="9062"/>
+            </w:tabs>
+            <w:rPr>
+              <w:rFonts w:eastAsiaTheme="minorEastAsia"/>
+              <w:noProof/>
+              <w:lang w:eastAsia="hu-HU"/>
+            </w:rPr>
+          </w:pPr>
+          <w:hyperlink w:anchor="_Toc214949276" w:history="1">
+            <w:r>
+              <w:rPr>
+                <w:rStyle w:val="Hiperhivatkozs"/>
+                <w:noProof/>
+              </w:rPr>
+              <w:t>Folyamat magyarázata</w:t>
+            </w:r>
+            <w:r>
+              <w:rPr>
+                <w:noProof/>
+                <w:webHidden/>
+              </w:rPr>
+              <w:tab/>
+            </w:r>
+            <w:r>
+              <w:rPr>
+                <w:noProof/>
+                <w:webHidden/>
+              </w:rPr>
+              <w:fldChar w:fldCharType="begin"/>
+            </w:r>
+            <w:r>
+              <w:rPr>
+                <w:noProof/>
+                <w:webHidden/>
+              </w:rPr>
+              <w:instrText xml:space="preserve"> PAGEREF _Toc214949276 \h </w:instrText>
+            </w:r>
+            <w:r>
+              <w:rPr>
+                <w:noProof/>
+                <w:webHidden/>
+              </w:rPr>
+            </w:r>
+            <w:r>
+              <w:rPr>
+                <w:noProof/>
+                <w:webHidden/>
+              </w:rPr>
+              <w:fldChar w:fldCharType="separate"/>
+            </w:r>
+            <w:r>
+              <w:rPr>
+                <w:noProof/>
+                <w:webHidden/>
+              </w:rPr>
+              <w:t>- 4 -</w:t>
+            </w:r>
+            <w:r>
+              <w:rPr>
+                <w:noProof/>
+                <w:webHidden/>
+              </w:rPr>
+              <w:fldChar w:fldCharType="end"/>
+            </w:r>
+          </w:hyperlink>
+        </w:p>
+        <w:p>
+          <w:pPr>
+            <w:pStyle w:val="TJ1"/>
+            <w:tabs>
+              <w:tab w:val="right" w:leader="dot" w:pos="9062"/>
+            </w:tabs>
+            <w:rPr>
+              <w:rFonts w:eastAsiaTheme="minorEastAsia"/>
+              <w:noProof/>
+              <w:lang w:eastAsia="hu-HU"/>
+            </w:rPr>
+          </w:pPr>
+          <w:hyperlink w:anchor="_Toc214949277" w:history="1">
+            <w:r>
+              <w:rPr>
+                <w:rStyle w:val="Hiperhivatkozs"/>
+                <w:noProof/>
+              </w:rPr>
+              <w:t>4. Étel hozzáadás ábrája</w:t>
+            </w:r>
+            <w:r>
+              <w:rPr>
+                <w:noProof/>
+                <w:webHidden/>
+              </w:rPr>
+              <w:tab/>
+            </w:r>
+            <w:r>
+              <w:rPr>
+                <w:noProof/>
+                <w:webHidden/>
+              </w:rPr>
+              <w:fldChar w:fldCharType="begin"/>
+            </w:r>
+            <w:r>
+              <w:rPr>
+                <w:noProof/>
+                <w:webHidden/>
+              </w:rPr>
+              <w:instrText xml:space="preserve"> PAGEREF _Toc214949277 \h </w:instrText>
+            </w:r>
+            <w:r>
+              <w:rPr>
+                <w:noProof/>
+                <w:webHidden/>
+              </w:rPr>
+            </w:r>
+            <w:r>
+              <w:rPr>
+                <w:noProof/>
+                <w:webHidden/>
+              </w:rPr>
+              <w:fldChar w:fldCharType="separate"/>
+            </w:r>
+            <w:r>
+              <w:rPr>
+                <w:noProof/>
+                <w:webHidden/>
+              </w:rPr>
+              <w:t>- 5 -</w:t>
+            </w:r>
+            <w:r>
+              <w:rPr>
+                <w:noProof/>
+                <w:webHidden/>
+              </w:rPr>
+              <w:fldChar w:fldCharType="end"/>
+            </w:r>
+          </w:hyperlink>
+        </w:p>
+        <w:p>
+          <w:pPr>
+            <w:pStyle w:val="TJ2"/>
+            <w:tabs>
+              <w:tab w:val="right" w:leader="dot" w:pos="9062"/>
+            </w:tabs>
+            <w:rPr>
+              <w:rFonts w:eastAsiaTheme="minorEastAsia"/>
+              <w:noProof/>
+              <w:lang w:eastAsia="hu-HU"/>
+            </w:rPr>
+          </w:pPr>
+          <w:hyperlink w:anchor="_Toc214949278" w:history="1">
+            <w:r>
+              <w:rPr>
+                <w:rStyle w:val="Hiperhivatkozs"/>
+                <w:noProof/>
+              </w:rPr>
+              <w:t>Folyamat magyarázata</w:t>
+            </w:r>
+            <w:r>
+              <w:rPr>
+                <w:noProof/>
+                <w:webHidden/>
+              </w:rPr>
+              <w:tab/>
+            </w:r>
+            <w:r>
+              <w:rPr>
+                <w:noProof/>
+                <w:webHidden/>
+              </w:rPr>
+              <w:fldChar w:fldCharType="begin"/>
+            </w:r>
+            <w:r>
+              <w:rPr>
+                <w:noProof/>
+                <w:webHidden/>
+              </w:rPr>
+              <w:instrText xml:space="preserve"> PAGEREF _Toc214949278 \h </w:instrText>
+            </w:r>
+            <w:r>
+              <w:rPr>
+                <w:noProof/>
+                <w:webHidden/>
+              </w:rPr>
+            </w:r>
+            <w:r>
+              <w:rPr>
+                <w:noProof/>
+                <w:webHidden/>
+              </w:rPr>
+              <w:fldChar w:fldCharType="separate"/>
+            </w:r>
+            <w:r>
+              <w:rPr>
+                <w:noProof/>
+                <w:webHidden/>
+              </w:rPr>
+              <w:t>- 5 -</w:t>
+            </w:r>
+            <w:r>
+              <w:rPr>
+                <w:noProof/>
+                <w:webHidden/>
+              </w:rPr>
+              <w:fldChar w:fldCharType="end"/>
+            </w:r>
+          </w:hyperlink>
+        </w:p>
+        <w:p>
+          <w:pPr>
+            <w:pStyle w:val="TJ1"/>
+            <w:tabs>
+              <w:tab w:val="right" w:leader="dot" w:pos="9062"/>
+            </w:tabs>
+            <w:rPr>
+              <w:rFonts w:eastAsiaTheme="minorEastAsia"/>
+              <w:noProof/>
+              <w:lang w:eastAsia="hu-HU"/>
+            </w:rPr>
+          </w:pPr>
+          <w:hyperlink w:anchor="_Toc214949279" w:history="1">
+            <w:r>
+              <w:rPr>
+                <w:rStyle w:val="Hiperhivatkozs"/>
+                <w:noProof/>
+              </w:rPr>
+              <w:t>5. Étkezés naplózás ábrája</w:t>
+            </w:r>
+            <w:r>
+              <w:rPr>
+                <w:noProof/>
+                <w:webHidden/>
+              </w:rPr>
+              <w:tab/>
+            </w:r>
+            <w:r>
+              <w:rPr>
+                <w:noProof/>
+                <w:webHidden/>
+              </w:rPr>
+              <w:fldChar w:fldCharType="begin"/>
+            </w:r>
+            <w:r>
+              <w:rPr>
+                <w:noProof/>
+                <w:webHidden/>
+              </w:rPr>
+              <w:instrText xml:space="preserve"> PAGEREF _Toc214949279 \h </w:instrText>
+            </w:r>
+            <w:r>
+              <w:rPr>
+                <w:noProof/>
+                <w:webHidden/>
+              </w:rPr>
+            </w:r>
+            <w:r>
+              <w:rPr>
+                <w:noProof/>
+                <w:webHidden/>
+              </w:rPr>
+              <w:fldChar w:fldCharType="separate"/>
+            </w:r>
+            <w:r>
+              <w:rPr>
+                <w:noProof/>
+                <w:webHidden/>
+              </w:rPr>
+              <w:t>- 6 -</w:t>
+            </w:r>
+            <w:r>
+              <w:rPr>
+                <w:noProof/>
+                <w:webHidden/>
+              </w:rPr>
+              <w:fldChar w:fldCharType="end"/>
+            </w:r>
+          </w:hyperlink>
+        </w:p>
+        <w:p>
+          <w:pPr>
+            <w:pStyle w:val="TJ2"/>
+            <w:tabs>
+              <w:tab w:val="right" w:leader="dot" w:pos="9062"/>
+            </w:tabs>
+            <w:rPr>
+              <w:rFonts w:eastAsiaTheme="minorEastAsia"/>
+              <w:noProof/>
+              <w:lang w:eastAsia="hu-HU"/>
+            </w:rPr>
+          </w:pPr>
+          <w:hyperlink w:anchor="_Toc214949280" w:history="1">
+            <w:r>
+              <w:rPr>
+                <w:rStyle w:val="Hiperhivatkozs"/>
+                <w:noProof/>
+              </w:rPr>
+              <w:t>Folyamat magyarázata</w:t>
+            </w:r>
+            <w:r>
+              <w:rPr>
+                <w:noProof/>
+                <w:webHidden/>
+              </w:rPr>
+              <w:tab/>
+            </w:r>
+            <w:r>
+              <w:rPr>
+                <w:noProof/>
+                <w:webHidden/>
+              </w:rPr>
+              <w:fldChar w:fldCharType="begin"/>
+            </w:r>
+            <w:r>
+              <w:rPr>
+                <w:noProof/>
+                <w:webHidden/>
+              </w:rPr>
+              <w:instrText xml:space="preserve"> PAGEREF _Toc214949280 \h </w:instrText>
+            </w:r>
+            <w:r>
+              <w:rPr>
+                <w:noProof/>
+                <w:webHidden/>
+              </w:rPr>
+            </w:r>
+            <w:r>
+              <w:rPr>
+                <w:noProof/>
+                <w:webHidden/>
+              </w:rPr>
+              <w:fldChar w:fldCharType="separate"/>
+            </w:r>
+            <w:r>
+              <w:rPr>
+                <w:noProof/>
+                <w:webHidden/>
+              </w:rPr>
+              <w:t>- 6 -</w:t>
             </w:r>
             <w:r>
               <w:rPr>
@@ -501,7 +936,7 @@
       <w:pPr>
         <w:pStyle w:val="Cmsor1"/>
       </w:pPr>
-      <w:bookmarkStart w:id="0" w:name="_Toc214433394"/>
+      <w:bookmarkStart w:id="0" w:name="_Toc214949271"/>
       <w:r>
         <w:lastRenderedPageBreak/>
         <w:t>1. Bejelentkezés ábrája</w:t>
@@ -599,7 +1034,7 @@
       <w:pPr>
         <w:pStyle w:val="Cmsor2"/>
       </w:pPr>
-      <w:bookmarkStart w:id="1" w:name="_Toc214433395"/>
+      <w:bookmarkStart w:id="1" w:name="_Toc214949272"/>
       <w:r>
         <w:t>Folyamat magyarázata:</w:t>
       </w:r>
@@ -650,7 +1085,15 @@
         </w:numPr>
       </w:pPr>
       <w:r>
-        <w:t>Adatok validitása. A program ellenőrzi hogy az adatok pontosak, létezik-e az adott e-maillel fiók, helyes-e a megadott jelszó.</w:t>
+        <w:t xml:space="preserve">Adatok </w:t>
+      </w:r>
+      <w:proofErr w:type="spellStart"/>
+      <w:r>
+        <w:t>validitása</w:t>
+      </w:r>
+      <w:proofErr w:type="spellEnd"/>
+      <w:r>
+        <w:t>. A program ellenőrzi hogy az adatok pontosak, létezik-e az adott e-maillel fiók, helyes-e a megadott jelszó.</w:t>
       </w:r>
     </w:p>
     <w:p>
@@ -698,7 +1141,23 @@
         </w:numPr>
       </w:pPr>
       <w:r>
-        <w:t>Van-e profil? Ellenőrzi a program hogy van e a user-hez userProfile illesztve az adatbázisban</w:t>
+        <w:t xml:space="preserve">Van-e profil? Ellenőrzi a program hogy van e a </w:t>
+      </w:r>
+      <w:proofErr w:type="spellStart"/>
+      <w:r>
+        <w:t>user-hez</w:t>
+      </w:r>
+      <w:proofErr w:type="spellEnd"/>
+      <w:r>
+        <w:t xml:space="preserve"> </w:t>
+      </w:r>
+      <w:proofErr w:type="spellStart"/>
+      <w:r>
+        <w:t>userProfile</w:t>
+      </w:r>
+      <w:proofErr w:type="spellEnd"/>
+      <w:r>
+        <w:t xml:space="preserve"> illesztve az adatbázisban</w:t>
       </w:r>
     </w:p>
     <w:p>
@@ -758,7 +1217,15 @@
         </w:numPr>
       </w:pPr>
       <w:r>
-        <w:t>Adatok validitása. Le ellenőrzi a program hogy reális adatokat adott-e meg a felhasználó, például 300 cm és 50 cm között van, vagy 13 és 120 között van a kor.</w:t>
+        <w:t xml:space="preserve">Adatok </w:t>
+      </w:r>
+      <w:proofErr w:type="spellStart"/>
+      <w:r>
+        <w:t>validitása</w:t>
+      </w:r>
+      <w:proofErr w:type="spellEnd"/>
+      <w:r>
+        <w:t>. Le ellenőrzi a program hogy reális adatokat adott-e meg a felhasználó, például 300 cm és 50 cm között van, vagy 13 és 120 között van a kor.</w:t>
       </w:r>
     </w:p>
     <w:p>
@@ -813,7 +1280,7 @@
       <w:pPr>
         <w:pStyle w:val="Cmsor1"/>
       </w:pPr>
-      <w:bookmarkStart w:id="2" w:name="_Toc214433396"/>
+      <w:bookmarkStart w:id="2" w:name="_Toc214949273"/>
       <w:r>
         <w:lastRenderedPageBreak/>
         <w:t>2. Regisztráció ábrája</w:t>
@@ -832,7 +1299,7 @@
       <w:pPr>
         <w:pStyle w:val="Cmsor2"/>
       </w:pPr>
-      <w:bookmarkStart w:id="3" w:name="_Toc214433397"/>
+      <w:bookmarkStart w:id="3" w:name="_Toc214949274"/>
       <w:r>
         <w:rPr>
           <w:noProof/>
@@ -950,7 +1417,15 @@
         </w:numPr>
       </w:pPr>
       <w:r>
-        <w:t>Adatok validitása: A rendszer ellenőrzi hogy az adatok megfelelnek-e az elvárásnak. Az elvárásokba beletartozik a érvényes e-mail cím, megfelelő jelszó.</w:t>
+        <w:t xml:space="preserve">Adatok </w:t>
+      </w:r>
+      <w:proofErr w:type="spellStart"/>
+      <w:r>
+        <w:t>validitása</w:t>
+      </w:r>
+      <w:proofErr w:type="spellEnd"/>
+      <w:r>
+        <w:t>: A rendszer ellenőrzi hogy az adatok megfelelnek-e az elvárásnak. Az elvárásokba beletartozik a érvényes e-mail cím, megfelelő jelszó.</w:t>
       </w:r>
     </w:p>
     <w:p>
@@ -1017,13 +1492,14 @@
       <w:pPr>
         <w:pStyle w:val="Cmsor1"/>
       </w:pPr>
+      <w:bookmarkStart w:id="4" w:name="_Toc214949275"/>
       <w:r>
         <w:rPr>
           <w:noProof/>
         </w:rPr>
         <w:lastRenderedPageBreak/>
         <w:drawing>
-          <wp:anchor distT="0" distB="0" distL="114300" distR="114300" simplePos="0" relativeHeight="251660288" behindDoc="0" locked="0" layoutInCell="1" allowOverlap="1" wp14:anchorId="5C73F28D" wp14:editId="2E734933">
+          <wp:anchor distT="0" distB="0" distL="114300" distR="114300" simplePos="0" relativeHeight="251660288" behindDoc="0" locked="0" layoutInCell="1" allowOverlap="1" wp14:anchorId="5C73F28D" wp14:editId="4715B761">
             <wp:simplePos x="0" y="0"/>
             <wp:positionH relativeFrom="margin">
               <wp:align>right</wp:align>
@@ -1032,14 +1508,14 @@
               <wp:posOffset>562822</wp:posOffset>
             </wp:positionV>
             <wp:extent cx="848360" cy="3178175"/>
-            <wp:effectExtent l="0" t="0" r="8890" b="3175"/>
+            <wp:effectExtent l="19050" t="19050" r="27940" b="22225"/>
             <wp:wrapThrough wrapText="bothSides">
               <wp:wrapPolygon edited="0">
-                <wp:start x="0" y="0"/>
-                <wp:lineTo x="0" y="21492"/>
-                <wp:lineTo x="21341" y="21492"/>
-                <wp:lineTo x="21341" y="0"/>
-                <wp:lineTo x="0" y="0"/>
+                <wp:start x="-485" y="-129"/>
+                <wp:lineTo x="-485" y="21622"/>
+                <wp:lineTo x="21826" y="21622"/>
+                <wp:lineTo x="21826" y="-129"/>
+                <wp:lineTo x="-485" y="-129"/>
               </wp:wrapPolygon>
             </wp:wrapThrough>
             <wp:docPr id="325499111" name="Kép 5" descr="A képen szöveg, diagram, Betűtípus, képernyőkép látható&#10;&#10;Előfordulhat, hogy az AI által létrehozott tartalom helytelen."/>
@@ -1073,6 +1549,11 @@
                     <a:prstGeom prst="rect">
                       <a:avLst/>
                     </a:prstGeom>
+                    <a:ln>
+                      <a:solidFill>
+                        <a:schemeClr val="accent1"/>
+                      </a:solidFill>
+                    </a:ln>
                   </pic:spPr>
                 </pic:pic>
               </a:graphicData>
@@ -1089,12 +1570,23 @@
       <w:r>
         <w:t>3. Tápanyagszámítás folyamatábrája</w:t>
       </w:r>
+      <w:bookmarkEnd w:id="4"/>
     </w:p>
     <w:p>
       <w:r>
         <w:tab/>
         <w:t>A tápanyagszámítás itt, a tápanyaglimitekre és célokra utal. Ebben beletartozik a naponta maximum kalória, a fehérje cél és a maximum zsír. Míg maga az ábra egyszerűnek látszódhat, mégis a program egyik legfőbb funkciója, amit matematikával hozzunk létre.</w:t>
       </w:r>
+    </w:p>
+    <w:p>
+      <w:pPr>
+        <w:pStyle w:val="Cmsor2"/>
+      </w:pPr>
+      <w:bookmarkStart w:id="5" w:name="_Toc214949276"/>
+      <w:r>
+        <w:t>Folyamat magyarázata</w:t>
+      </w:r>
+      <w:bookmarkEnd w:id="5"/>
     </w:p>
     <w:p>
       <w:pPr>
@@ -1159,9 +1651,438 @@
         <w:t>Vége.</w:t>
       </w:r>
     </w:p>
+    <w:p>
+      <w:pPr>
+        <w:pStyle w:val="Cmsor1"/>
+      </w:pPr>
+      <w:bookmarkStart w:id="6" w:name="_Toc214949277"/>
+      <w:r>
+        <w:lastRenderedPageBreak/>
+        <w:t>4. Étel hozzáadás ábrája</w:t>
+      </w:r>
+      <w:bookmarkEnd w:id="6"/>
+    </w:p>
+    <w:p>
+      <w:r>
+        <w:t>A következő ábra a felhasználók által létrehozott ételek folyamatábráját magyarázza el. Ennek a funkciónak köszönhetően lesz az adatbázis ételekkel feltöltve.</w:t>
+      </w:r>
+    </w:p>
+    <w:p>
+      <w:pPr>
+        <w:pStyle w:val="Cmsor2"/>
+      </w:pPr>
+      <w:bookmarkStart w:id="7" w:name="_Toc214949278"/>
+      <w:r>
+        <w:t>Folyamat magyarázata</w:t>
+      </w:r>
+      <w:bookmarkEnd w:id="7"/>
+    </w:p>
+    <w:p>
+      <w:pPr>
+        <w:pStyle w:val="Listaszerbekezds"/>
+        <w:numPr>
+          <w:ilvl w:val="0"/>
+          <w:numId w:val="20"/>
+        </w:numPr>
+      </w:pPr>
+      <w:r>
+        <w:rPr>
+          <w:noProof/>
+        </w:rPr>
+        <w:drawing>
+          <wp:anchor distT="0" distB="0" distL="114300" distR="114300" simplePos="0" relativeHeight="251661312" behindDoc="1" locked="0" layoutInCell="1" allowOverlap="1" wp14:anchorId="071CA212" wp14:editId="3FE2E43E">
+            <wp:simplePos x="0" y="0"/>
+            <wp:positionH relativeFrom="margin">
+              <wp:posOffset>3996055</wp:posOffset>
+            </wp:positionH>
+            <wp:positionV relativeFrom="paragraph">
+              <wp:posOffset>5080</wp:posOffset>
+            </wp:positionV>
+            <wp:extent cx="1768475" cy="4438650"/>
+            <wp:effectExtent l="19050" t="19050" r="22225" b="19050"/>
+            <wp:wrapTight wrapText="bothSides">
+              <wp:wrapPolygon edited="0">
+                <wp:start x="-233" y="-93"/>
+                <wp:lineTo x="-233" y="21600"/>
+                <wp:lineTo x="21639" y="21600"/>
+                <wp:lineTo x="21639" y="-93"/>
+                <wp:lineTo x="-233" y="-93"/>
+              </wp:wrapPolygon>
+            </wp:wrapTight>
+            <wp:docPr id="6" name="Kép 6"/>
+            <wp:cNvGraphicFramePr>
+              <a:graphicFrameLocks xmlns:a="http://schemas.openxmlformats.org/drawingml/2006/main" noChangeAspect="1"/>
+            </wp:cNvGraphicFramePr>
+            <a:graphic xmlns:a="http://schemas.openxmlformats.org/drawingml/2006/main">
+              <a:graphicData uri="http://schemas.openxmlformats.org/drawingml/2006/picture">
+                <pic:pic xmlns:pic="http://schemas.openxmlformats.org/drawingml/2006/picture">
+                  <pic:nvPicPr>
+                    <pic:cNvPr id="6" name="Kép 6"/>
+                    <pic:cNvPicPr/>
+                  </pic:nvPicPr>
+                  <pic:blipFill>
+                    <a:blip r:embed="rId11">
+                      <a:extLst>
+                        <a:ext uri="{28A0092B-C50C-407E-A947-70E740481C1C}">
+                          <a14:useLocalDpi xmlns:a14="http://schemas.microsoft.com/office/drawing/2010/main" val="0"/>
+                        </a:ext>
+                      </a:extLst>
+                    </a:blip>
+                    <a:stretch>
+                      <a:fillRect/>
+                    </a:stretch>
+                  </pic:blipFill>
+                  <pic:spPr>
+                    <a:xfrm>
+                      <a:off x="0" y="0"/>
+                      <a:ext cx="1768475" cy="4438650"/>
+                    </a:xfrm>
+                    <a:prstGeom prst="rect">
+                      <a:avLst/>
+                    </a:prstGeom>
+                    <a:ln>
+                      <a:solidFill>
+                        <a:schemeClr val="accent1">
+                          <a:lumMod val="75000"/>
+                        </a:schemeClr>
+                      </a:solidFill>
+                    </a:ln>
+                  </pic:spPr>
+                </pic:pic>
+              </a:graphicData>
+            </a:graphic>
+            <wp14:sizeRelH relativeFrom="margin">
+              <wp14:pctWidth>0</wp14:pctWidth>
+            </wp14:sizeRelH>
+            <wp14:sizeRelV relativeFrom="margin">
+              <wp14:pctHeight>0</wp14:pctHeight>
+            </wp14:sizeRelV>
+          </wp:anchor>
+        </w:drawing>
+      </w:r>
+      <w:r>
+        <w:t>Start, a folyamat elkezdődik.</w:t>
+      </w:r>
+    </w:p>
+    <w:p>
+      <w:pPr>
+        <w:pStyle w:val="Listaszerbekezds"/>
+        <w:numPr>
+          <w:ilvl w:val="0"/>
+          <w:numId w:val="20"/>
+        </w:numPr>
+      </w:pPr>
+      <w:r>
+        <w:t>Adatok bevitele, a felhasználó feltölti az adatokat, ebbe bele tartozik az étel tápértéke, neve illetve márkája. A név és márka alapján tudnak majd más felhasználók hivatkozni az ételre.</w:t>
+      </w:r>
+    </w:p>
+    <w:p>
+      <w:pPr>
+        <w:pStyle w:val="Listaszerbekezds"/>
+        <w:numPr>
+          <w:ilvl w:val="0"/>
+          <w:numId w:val="20"/>
+        </w:numPr>
+      </w:pPr>
+      <w:r>
+        <w:t>Gombnyomás, a felhasználó megnyomja a feltöltés gombot.</w:t>
+      </w:r>
+    </w:p>
+    <w:p>
+      <w:pPr>
+        <w:pStyle w:val="Listaszerbekezds"/>
+        <w:numPr>
+          <w:ilvl w:val="0"/>
+          <w:numId w:val="20"/>
+        </w:numPr>
+      </w:pPr>
+      <w:r>
+        <w:t xml:space="preserve">Adatok </w:t>
+      </w:r>
+      <w:proofErr w:type="spellStart"/>
+      <w:r>
+        <w:t>validálása</w:t>
+      </w:r>
+      <w:proofErr w:type="spellEnd"/>
+      <w:r>
+        <w:t>, a rendszer ellenőrzi hogy megfelelnek e az adatok, illetve hogy minden ki lett e töltve.</w:t>
+      </w:r>
+    </w:p>
+    <w:p>
+      <w:pPr>
+        <w:pStyle w:val="Listaszerbekezds"/>
+        <w:numPr>
+          <w:ilvl w:val="1"/>
+          <w:numId w:val="20"/>
+        </w:numPr>
+      </w:pPr>
+      <w:r>
+        <w:t>Ha hamis, azaz rosszak az adatok, a rendszer kiír egy hibaüzenetet oda, ahol hibát talált, majd a folyamat újra indul az adatok bevitelétől.</w:t>
+      </w:r>
+    </w:p>
+    <w:p>
+      <w:pPr>
+        <w:pStyle w:val="Listaszerbekezds"/>
+        <w:numPr>
+          <w:ilvl w:val="1"/>
+          <w:numId w:val="20"/>
+        </w:numPr>
+      </w:pPr>
+      <w:r>
+        <w:t>Ha igaz, azaz az adatok megfelelőek, a folyamat tovább halad.</w:t>
+      </w:r>
+    </w:p>
+    <w:p>
+      <w:pPr>
+        <w:pStyle w:val="Listaszerbekezds"/>
+        <w:numPr>
+          <w:ilvl w:val="0"/>
+          <w:numId w:val="20"/>
+        </w:numPr>
+      </w:pPr>
+      <w:r>
+        <w:t>Adatok feltöltése az adatbázisba, a rendszer végül feltölti az adatokat az adatbázisba.</w:t>
+      </w:r>
+    </w:p>
+    <w:p>
+      <w:pPr>
+        <w:pStyle w:val="Listaszerbekezds"/>
+        <w:numPr>
+          <w:ilvl w:val="0"/>
+          <w:numId w:val="20"/>
+        </w:numPr>
+      </w:pPr>
+      <w:r>
+        <w:t>Vége.</w:t>
+      </w:r>
+    </w:p>
+    <w:p>
+      <w:pPr>
+        <w:pStyle w:val="Cmsor1"/>
+      </w:pPr>
+      <w:bookmarkStart w:id="8" w:name="_Toc214949279"/>
+      <w:r>
+        <w:lastRenderedPageBreak/>
+        <w:t>5.</w:t>
+      </w:r>
+      <w:r>
+        <w:t xml:space="preserve"> Étkezés naplózás ábrája</w:t>
+      </w:r>
+      <w:bookmarkEnd w:id="8"/>
+    </w:p>
+    <w:p>
+      <w:r>
+        <w:t>A Corelytics egyik legfőbb funkciója, ezzel tudják a felhasználók naplózni a bevitt kalóriát.</w:t>
+      </w:r>
+    </w:p>
+    <w:p>
+      <w:pPr>
+        <w:pStyle w:val="Cmsor2"/>
+      </w:pPr>
+      <w:bookmarkStart w:id="9" w:name="_Toc214949280"/>
+      <w:r>
+        <w:rPr>
+          <w:noProof/>
+        </w:rPr>
+        <w:drawing>
+          <wp:anchor distT="0" distB="0" distL="114300" distR="114300" simplePos="0" relativeHeight="251662336" behindDoc="1" locked="0" layoutInCell="1" allowOverlap="1" wp14:anchorId="1BDDB9F7" wp14:editId="64298899">
+            <wp:simplePos x="0" y="0"/>
+            <wp:positionH relativeFrom="margin">
+              <wp:align>right</wp:align>
+            </wp:positionH>
+            <wp:positionV relativeFrom="paragraph">
+              <wp:posOffset>4445</wp:posOffset>
+            </wp:positionV>
+            <wp:extent cx="1761490" cy="5105400"/>
+            <wp:effectExtent l="19050" t="19050" r="10160" b="19050"/>
+            <wp:wrapTight wrapText="bothSides">
+              <wp:wrapPolygon edited="0">
+                <wp:start x="-234" y="-81"/>
+                <wp:lineTo x="-234" y="21600"/>
+                <wp:lineTo x="21491" y="21600"/>
+                <wp:lineTo x="21491" y="-81"/>
+                <wp:lineTo x="-234" y="-81"/>
+              </wp:wrapPolygon>
+            </wp:wrapTight>
+            <wp:docPr id="10" name="Kép 10"/>
+            <wp:cNvGraphicFramePr>
+              <a:graphicFrameLocks xmlns:a="http://schemas.openxmlformats.org/drawingml/2006/main" noChangeAspect="1"/>
+            </wp:cNvGraphicFramePr>
+            <a:graphic xmlns:a="http://schemas.openxmlformats.org/drawingml/2006/main">
+              <a:graphicData uri="http://schemas.openxmlformats.org/drawingml/2006/picture">
+                <pic:pic xmlns:pic="http://schemas.openxmlformats.org/drawingml/2006/picture">
+                  <pic:nvPicPr>
+                    <pic:cNvPr id="10" name="Kép 10"/>
+                    <pic:cNvPicPr/>
+                  </pic:nvPicPr>
+                  <pic:blipFill>
+                    <a:blip r:embed="rId12">
+                      <a:extLst>
+                        <a:ext uri="{28A0092B-C50C-407E-A947-70E740481C1C}">
+                          <a14:useLocalDpi xmlns:a14="http://schemas.microsoft.com/office/drawing/2010/main" val="0"/>
+                        </a:ext>
+                      </a:extLst>
+                    </a:blip>
+                    <a:stretch>
+                      <a:fillRect/>
+                    </a:stretch>
+                  </pic:blipFill>
+                  <pic:spPr>
+                    <a:xfrm>
+                      <a:off x="0" y="0"/>
+                      <a:ext cx="1761490" cy="5105400"/>
+                    </a:xfrm>
+                    <a:prstGeom prst="rect">
+                      <a:avLst/>
+                    </a:prstGeom>
+                    <a:ln>
+                      <a:solidFill>
+                        <a:schemeClr val="accent1">
+                          <a:lumMod val="75000"/>
+                        </a:schemeClr>
+                      </a:solidFill>
+                    </a:ln>
+                  </pic:spPr>
+                </pic:pic>
+              </a:graphicData>
+            </a:graphic>
+            <wp14:sizeRelH relativeFrom="margin">
+              <wp14:pctWidth>0</wp14:pctWidth>
+            </wp14:sizeRelH>
+            <wp14:sizeRelV relativeFrom="margin">
+              <wp14:pctHeight>0</wp14:pctHeight>
+            </wp14:sizeRelV>
+          </wp:anchor>
+        </w:drawing>
+      </w:r>
+      <w:r>
+        <w:t>Folyamat magyarázata</w:t>
+      </w:r>
+      <w:bookmarkEnd w:id="9"/>
+    </w:p>
+    <w:p>
+      <w:pPr>
+        <w:pStyle w:val="Listaszerbekezds"/>
+        <w:numPr>
+          <w:ilvl w:val="0"/>
+          <w:numId w:val="22"/>
+        </w:numPr>
+      </w:pPr>
+      <w:r>
+        <w:t>Start, a folyamat elkezdődik.</w:t>
+      </w:r>
+    </w:p>
+    <w:p>
+      <w:pPr>
+        <w:pStyle w:val="Listaszerbekezds"/>
+        <w:numPr>
+          <w:ilvl w:val="0"/>
+          <w:numId w:val="22"/>
+        </w:numPr>
+      </w:pPr>
+      <w:r>
+        <w:t>Étkezés kiválasztása, a felhasználó kiválasztja hogy mikor evett, amibe beletartozik az ebéd, reggeli.</w:t>
+      </w:r>
+    </w:p>
+    <w:p>
+      <w:pPr>
+        <w:pStyle w:val="Listaszerbekezds"/>
+        <w:numPr>
+          <w:ilvl w:val="0"/>
+          <w:numId w:val="22"/>
+        </w:numPr>
+      </w:pPr>
+      <w:r>
+        <w:t>Adatok beírása, a felhasználó beírja az adatokat a keresőbe, ami lehet az étel neve, márkája.</w:t>
+      </w:r>
+    </w:p>
+    <w:p>
+      <w:pPr>
+        <w:pStyle w:val="Listaszerbekezds"/>
+        <w:numPr>
+          <w:ilvl w:val="0"/>
+          <w:numId w:val="22"/>
+        </w:numPr>
+      </w:pPr>
+      <w:r>
+        <w:t>Keresés, a rendszer átnézi az adatbázist és vissza dobja a találatokat</w:t>
+      </w:r>
+    </w:p>
+    <w:p>
+      <w:pPr>
+        <w:pStyle w:val="Listaszerbekezds"/>
+        <w:numPr>
+          <w:ilvl w:val="1"/>
+          <w:numId w:val="22"/>
+        </w:numPr>
+      </w:pPr>
+      <w:r>
+        <w:t>Ha hamis, azaz nem talált semmit, felajánlja hogy a felhasználó adja hozzá az ételt.</w:t>
+      </w:r>
+    </w:p>
+    <w:p>
+      <w:pPr>
+        <w:pStyle w:val="Listaszerbekezds"/>
+        <w:numPr>
+          <w:ilvl w:val="1"/>
+          <w:numId w:val="22"/>
+        </w:numPr>
+      </w:pPr>
+      <w:r>
+        <w:t>Ha igaz, azaz talált, akkor a felhasználó kitudja választani.</w:t>
+      </w:r>
+    </w:p>
+    <w:p>
+      <w:pPr>
+        <w:pStyle w:val="Listaszerbekezds"/>
+        <w:numPr>
+          <w:ilvl w:val="0"/>
+          <w:numId w:val="22"/>
+        </w:numPr>
+      </w:pPr>
+      <w:r>
+        <w:t>Mennyiség megadása. A felhasználó beírja mennyi adagot evett meg, és a rendszer ezzel szorozza meg az étel adatait.</w:t>
+      </w:r>
+    </w:p>
+    <w:p>
+      <w:pPr>
+        <w:pStyle w:val="Listaszerbekezds"/>
+        <w:numPr>
+          <w:ilvl w:val="0"/>
+          <w:numId w:val="22"/>
+        </w:numPr>
+      </w:pPr>
+      <w:r>
+        <w:t>Gombnyomás, a felhasználó megnyomja az étel naplózása gombot.</w:t>
+      </w:r>
+    </w:p>
+    <w:p>
+      <w:pPr>
+        <w:pStyle w:val="Listaszerbekezds"/>
+        <w:numPr>
+          <w:ilvl w:val="0"/>
+          <w:numId w:val="22"/>
+        </w:numPr>
+      </w:pPr>
+      <w:r>
+        <w:t>Adatok naplózása, a rendszer feltölti az adatbázisba tápanyagokat, illetve az elfogyasztott ételek azonosítóját.</w:t>
+      </w:r>
+    </w:p>
+    <w:p>
+      <w:pPr>
+        <w:pStyle w:val="Listaszerbekezds"/>
+        <w:numPr>
+          <w:ilvl w:val="0"/>
+          <w:numId w:val="22"/>
+        </w:numPr>
+      </w:pPr>
+      <w:r>
+        <w:t>Vége.</w:t>
+      </w:r>
+    </w:p>
     <w:sectPr>
-      <w:headerReference w:type="default" r:id="rId11"/>
-      <w:footerReference w:type="default" r:id="rId12"/>
+      <w:headerReference w:type="default" r:id="rId13"/>
+      <w:footerReference w:type="default" r:id="rId14"/>
       <w:pgSz w:w="11906" w:h="16838"/>
       <w:pgMar w:top="1417" w:right="1417" w:bottom="1417" w:left="1417" w:header="708" w:footer="708" w:gutter="0"/>
       <w:pgNumType w:fmt="numberInDash" w:start="0"/>
@@ -1174,7 +2095,7 @@
 </file>
 
 <file path=word/endnotes.xml><?xml version="1.0" encoding="utf-8"?>
-<w:endnotes xmlns:wpc="http://schemas.microsoft.com/office/word/2010/wordprocessingCanvas" xmlns:cx="http://schemas.microsoft.com/office/drawing/2014/chartex" xmlns:cx1="http://schemas.microsoft.com/office/drawing/2015/9/8/chartex" xmlns:cx2="http://schemas.microsoft.com/office/drawing/2015/10/21/chartex" xmlns:cx3="http://schemas.microsoft.com/office/drawing/2016/5/9/chartex" xmlns:cx4="http://schemas.microsoft.com/office/drawing/2016/5/10/chartex" xmlns:cx5="http://schemas.microsoft.com/office/drawing/2016/5/11/chartex" xmlns:cx6="http://schemas.microsoft.com/office/drawing/2016/5/12/chartex" xmlns:cx7="http://schemas.microsoft.com/office/drawing/2016/5/13/chartex" xmlns:cx8="http://schemas.microsoft.com/office/drawing/2016/5/14/chartex" xmlns:mc="http://schemas.openxmlformats.org/markup-compatibility/2006" xmlns:aink="http://schemas.microsoft.com/office/drawing/2016/ink" xmlns:am3d="http://schemas.microsoft.com/office/drawing/2017/model3d" xmlns:o="urn:schemas-microsoft-com:office:office" xmlns:oel="http://schemas.microsoft.com/office/2019/extlst" xmlns:r="http://schemas.openxmlformats.org/officeDocument/2006/relationships" xmlns:m="http://schemas.openxmlformats.org/officeDocument/2006/math" xmlns:v="urn:schemas-microsoft-com:vml" xmlns:wp14="http://schemas.microsoft.com/office/word/2010/wordprocessingDrawing" xmlns:wp="http://schemas.openxmlformats.org/drawingml/2006/wordprocessingDrawing" xmlns:w10="urn:schemas-microsoft-com:office:word" xmlns:w="http://schemas.openxmlformats.org/wordprocessingml/2006/main" xmlns:w14="http://schemas.microsoft.com/office/word/2010/wordml" xmlns:w15="http://schemas.microsoft.com/office/word/2012/wordml" xmlns:w16cex="http://schemas.microsoft.com/office/word/2018/wordml/cex" xmlns:w16cid="http://schemas.microsoft.com/office/word/2016/wordml/cid" xmlns:w16="http://schemas.microsoft.com/office/word/2018/wordml" xmlns:w16du="http://schemas.microsoft.com/office/word/2023/wordml/word16du" xmlns:w16sdtdh="http://schemas.microsoft.com/office/word/2020/wordml/sdtdatahash" xmlns:w16sdtfl="http://schemas.microsoft.com/office/word/2024/wordml/sdtformatlock" xmlns:w16se="http://schemas.microsoft.com/office/word/2015/wordml/symex" xmlns:wpg="http://schemas.microsoft.com/office/word/2010/wordprocessingGroup" xmlns:wpi="http://schemas.microsoft.com/office/word/2010/wordprocessingInk" xmlns:wne="http://schemas.microsoft.com/office/word/2006/wordml" xmlns:wps="http://schemas.microsoft.com/office/word/2010/wordprocessingShape" mc:Ignorable="w14 w15 w16se w16cid w16 w16cex w16sdtdh w16sdtfl w16du wp14">
+<w:endnotes xmlns:wpc="http://schemas.microsoft.com/office/word/2010/wordprocessingCanvas" xmlns:cx="http://schemas.microsoft.com/office/drawing/2014/chartex" xmlns:cx1="http://schemas.microsoft.com/office/drawing/2015/9/8/chartex" xmlns:cx2="http://schemas.microsoft.com/office/drawing/2015/10/21/chartex" xmlns:cx3="http://schemas.microsoft.com/office/drawing/2016/5/9/chartex" xmlns:cx4="http://schemas.microsoft.com/office/drawing/2016/5/10/chartex" xmlns:cx5="http://schemas.microsoft.com/office/drawing/2016/5/11/chartex" xmlns:cx6="http://schemas.microsoft.com/office/drawing/2016/5/12/chartex" xmlns:cx7="http://schemas.microsoft.com/office/drawing/2016/5/13/chartex" xmlns:cx8="http://schemas.microsoft.com/office/drawing/2016/5/14/chartex" xmlns:mc="http://schemas.openxmlformats.org/markup-compatibility/2006" xmlns:aink="http://schemas.microsoft.com/office/drawing/2016/ink" xmlns:am3d="http://schemas.microsoft.com/office/drawing/2017/model3d" xmlns:o="urn:schemas-microsoft-com:office:office" xmlns:r="http://schemas.openxmlformats.org/officeDocument/2006/relationships" xmlns:m="http://schemas.openxmlformats.org/officeDocument/2006/math" xmlns:v="urn:schemas-microsoft-com:vml" xmlns:wp14="http://schemas.microsoft.com/office/word/2010/wordprocessingDrawing" xmlns:wp="http://schemas.openxmlformats.org/drawingml/2006/wordprocessingDrawing" xmlns:w10="urn:schemas-microsoft-com:office:word" xmlns:w="http://schemas.openxmlformats.org/wordprocessingml/2006/main" xmlns:w14="http://schemas.microsoft.com/office/word/2010/wordml" xmlns:w15="http://schemas.microsoft.com/office/word/2012/wordml" xmlns:w16cex="http://schemas.microsoft.com/office/word/2018/wordml/cex" xmlns:w16cid="http://schemas.microsoft.com/office/word/2016/wordml/cid" xmlns:w16="http://schemas.microsoft.com/office/word/2018/wordml" xmlns:w16sdtdh="http://schemas.microsoft.com/office/word/2020/wordml/sdtdatahash" xmlns:w16se="http://schemas.microsoft.com/office/word/2015/wordml/symex" xmlns:wpg="http://schemas.microsoft.com/office/word/2010/wordprocessingGroup" xmlns:wpi="http://schemas.microsoft.com/office/word/2010/wordprocessingInk" xmlns:wne="http://schemas.microsoft.com/office/word/2006/wordml" xmlns:wps="http://schemas.microsoft.com/office/word/2010/wordprocessingShape" mc:Ignorable="w14 w15 w16se w16cid w16 w16cex w16sdtdh wp14">
   <w:endnote w:type="separator" w:id="-1">
     <w:p>
       <w:pPr>
@@ -1199,7 +2120,7 @@
 </file>
 
 <file path=word/footer1.xml><?xml version="1.0" encoding="utf-8"?>
-<w:ftr xmlns:wpc="http://schemas.microsoft.com/office/word/2010/wordprocessingCanvas" xmlns:cx="http://schemas.microsoft.com/office/drawing/2014/chartex" xmlns:cx1="http://schemas.microsoft.com/office/drawing/2015/9/8/chartex" xmlns:cx2="http://schemas.microsoft.com/office/drawing/2015/10/21/chartex" xmlns:cx3="http://schemas.microsoft.com/office/drawing/2016/5/9/chartex" xmlns:cx4="http://schemas.microsoft.com/office/drawing/2016/5/10/chartex" xmlns:cx5="http://schemas.microsoft.com/office/drawing/2016/5/11/chartex" xmlns:cx6="http://schemas.microsoft.com/office/drawing/2016/5/12/chartex" xmlns:cx7="http://schemas.microsoft.com/office/drawing/2016/5/13/chartex" xmlns:cx8="http://schemas.microsoft.com/office/drawing/2016/5/14/chartex" xmlns:mc="http://schemas.openxmlformats.org/markup-compatibility/2006" xmlns:aink="http://schemas.microsoft.com/office/drawing/2016/ink" xmlns:am3d="http://schemas.microsoft.com/office/drawing/2017/model3d" xmlns:o="urn:schemas-microsoft-com:office:office" xmlns:oel="http://schemas.microsoft.com/office/2019/extlst" xmlns:r="http://schemas.openxmlformats.org/officeDocument/2006/relationships" xmlns:m="http://schemas.openxmlformats.org/officeDocument/2006/math" xmlns:v="urn:schemas-microsoft-com:vml" xmlns:wp14="http://schemas.microsoft.com/office/word/2010/wordprocessingDrawing" xmlns:wp="http://schemas.openxmlformats.org/drawingml/2006/wordprocessingDrawing" xmlns:w10="urn:schemas-microsoft-com:office:word" xmlns:w="http://schemas.openxmlformats.org/wordprocessingml/2006/main" xmlns:w14="http://schemas.microsoft.com/office/word/2010/wordml" xmlns:w15="http://schemas.microsoft.com/office/word/2012/wordml" xmlns:w16cex="http://schemas.microsoft.com/office/word/2018/wordml/cex" xmlns:w16cid="http://schemas.microsoft.com/office/word/2016/wordml/cid" xmlns:w16="http://schemas.microsoft.com/office/word/2018/wordml" xmlns:w16du="http://schemas.microsoft.com/office/word/2023/wordml/word16du" xmlns:w16sdtdh="http://schemas.microsoft.com/office/word/2020/wordml/sdtdatahash" xmlns:w16sdtfl="http://schemas.microsoft.com/office/word/2024/wordml/sdtformatlock" xmlns:w16se="http://schemas.microsoft.com/office/word/2015/wordml/symex" xmlns:wpg="http://schemas.microsoft.com/office/word/2010/wordprocessingGroup" xmlns:wpi="http://schemas.microsoft.com/office/word/2010/wordprocessingInk" xmlns:wne="http://schemas.microsoft.com/office/word/2006/wordml" xmlns:wps="http://schemas.microsoft.com/office/word/2010/wordprocessingShape" mc:Ignorable="w14 w15 w16se w16cid w16 w16cex w16sdtdh w16sdtfl w16du wp14">
+<w:ftr xmlns:wpc="http://schemas.microsoft.com/office/word/2010/wordprocessingCanvas" xmlns:cx="http://schemas.microsoft.com/office/drawing/2014/chartex" xmlns:cx1="http://schemas.microsoft.com/office/drawing/2015/9/8/chartex" xmlns:cx2="http://schemas.microsoft.com/office/drawing/2015/10/21/chartex" xmlns:cx3="http://schemas.microsoft.com/office/drawing/2016/5/9/chartex" xmlns:cx4="http://schemas.microsoft.com/office/drawing/2016/5/10/chartex" xmlns:cx5="http://schemas.microsoft.com/office/drawing/2016/5/11/chartex" xmlns:cx6="http://schemas.microsoft.com/office/drawing/2016/5/12/chartex" xmlns:cx7="http://schemas.microsoft.com/office/drawing/2016/5/13/chartex" xmlns:cx8="http://schemas.microsoft.com/office/drawing/2016/5/14/chartex" xmlns:mc="http://schemas.openxmlformats.org/markup-compatibility/2006" xmlns:aink="http://schemas.microsoft.com/office/drawing/2016/ink" xmlns:am3d="http://schemas.microsoft.com/office/drawing/2017/model3d" xmlns:o="urn:schemas-microsoft-com:office:office" xmlns:r="http://schemas.openxmlformats.org/officeDocument/2006/relationships" xmlns:m="http://schemas.openxmlformats.org/officeDocument/2006/math" xmlns:v="urn:schemas-microsoft-com:vml" xmlns:wp14="http://schemas.microsoft.com/office/word/2010/wordprocessingDrawing" xmlns:wp="http://schemas.openxmlformats.org/drawingml/2006/wordprocessingDrawing" xmlns:w10="urn:schemas-microsoft-com:office:word" xmlns:w="http://schemas.openxmlformats.org/wordprocessingml/2006/main" xmlns:w14="http://schemas.microsoft.com/office/word/2010/wordml" xmlns:w15="http://schemas.microsoft.com/office/word/2012/wordml" xmlns:w16cex="http://schemas.microsoft.com/office/word/2018/wordml/cex" xmlns:w16cid="http://schemas.microsoft.com/office/word/2016/wordml/cid" xmlns:w16="http://schemas.microsoft.com/office/word/2018/wordml" xmlns:w16sdtdh="http://schemas.microsoft.com/office/word/2020/wordml/sdtdatahash" xmlns:w16se="http://schemas.microsoft.com/office/word/2015/wordml/symex" xmlns:wpg="http://schemas.microsoft.com/office/word/2010/wordprocessingGroup" xmlns:wpi="http://schemas.microsoft.com/office/word/2010/wordprocessingInk" xmlns:wne="http://schemas.microsoft.com/office/word/2006/wordml" xmlns:wps="http://schemas.microsoft.com/office/word/2010/wordprocessingShape" mc:Ignorable="w14 w15 w16se w16cid w16 w16cex w16sdtdh wp14">
   <w:sdt>
     <w:sdtPr>
       <w:id w:val="-1219903214"/>
@@ -1208,6 +2129,7 @@
         <w:docPartUnique/>
       </w:docPartObj>
     </w:sdtPr>
+    <w:sdtEndPr/>
     <w:sdtContent>
       <w:p>
         <w:pPr>
@@ -1292,7 +2214,7 @@
                 </wp:anchor>
               </w:drawing>
             </mc:Choice>
-            <mc:Fallback>
+            <mc:Fallback xmlns:w16sdtfl="http://schemas.microsoft.com/office/word/2024/wordml/sdtformatlock" xmlns:w16du="http://schemas.microsoft.com/office/word/2023/wordml/word16du" xmlns:oel="http://schemas.microsoft.com/office/2019/extlst">
               <w:pict>
                 <v:rect w14:anchorId="634EFE85" id="Téglalap 8" o:spid="_x0000_s1026" style="position:absolute;margin-left:-131.35pt;margin-top:-31.75pt;width:133.95pt;height:190.65pt;rotation:-2528204fd;z-index:251660288;visibility:visible;mso-wrap-style:square;mso-width-percent:0;mso-height-percent:0;mso-wrap-distance-left:9pt;mso-wrap-distance-top:0;mso-wrap-distance-right:9pt;mso-wrap-distance-bottom:0;mso-position-horizontal:absolute;mso-position-horizontal-relative:text;mso-position-vertical:absolute;mso-position-vertical-relative:text;mso-width-percent:0;mso-height-percent:0;mso-width-relative:margin;mso-height-relative:margin;v-text-anchor:middle" o:gfxdata="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" fillcolor="#d9e2f3 [660]" strokecolor="white [3212]" strokeweight="1pt"/>
               </w:pict>
@@ -1360,7 +2282,7 @@
                 </wp:inline>
               </w:drawing>
             </mc:Choice>
-            <mc:Fallback>
+            <mc:Fallback xmlns:w16sdtfl="http://schemas.microsoft.com/office/word/2024/wordml/sdtformatlock" xmlns:w16du="http://schemas.microsoft.com/office/word/2023/wordml/word16du" xmlns:oel="http://schemas.microsoft.com/office/2019/extlst">
               <w:pict>
                 <v:shapetype w14:anchorId="488BE725" id="_x0000_t110" coordsize="21600,21600" o:spt="110" path="m10800,l,10800,10800,21600,21600,10800xe">
                   <v:stroke joinstyle="miter"/>
@@ -1407,7 +2329,7 @@
 </file>
 
 <file path=word/footnotes.xml><?xml version="1.0" encoding="utf-8"?>
-<w:footnotes xmlns:wpc="http://schemas.microsoft.com/office/word/2010/wordprocessingCanvas" xmlns:cx="http://schemas.microsoft.com/office/drawing/2014/chartex" xmlns:cx1="http://schemas.microsoft.com/office/drawing/2015/9/8/chartex" xmlns:cx2="http://schemas.microsoft.com/office/drawing/2015/10/21/chartex" xmlns:cx3="http://schemas.microsoft.com/office/drawing/2016/5/9/chartex" xmlns:cx4="http://schemas.microsoft.com/office/drawing/2016/5/10/chartex" xmlns:cx5="http://schemas.microsoft.com/office/drawing/2016/5/11/chartex" xmlns:cx6="http://schemas.microsoft.com/office/drawing/2016/5/12/chartex" xmlns:cx7="http://schemas.microsoft.com/office/drawing/2016/5/13/chartex" xmlns:cx8="http://schemas.microsoft.com/office/drawing/2016/5/14/chartex" xmlns:mc="http://schemas.openxmlformats.org/markup-compatibility/2006" xmlns:aink="http://schemas.microsoft.com/office/drawing/2016/ink" xmlns:am3d="http://schemas.microsoft.com/office/drawing/2017/model3d" xmlns:o="urn:schemas-microsoft-com:office:office" xmlns:oel="http://schemas.microsoft.com/office/2019/extlst" xmlns:r="http://schemas.openxmlformats.org/officeDocument/2006/relationships" xmlns:m="http://schemas.openxmlformats.org/officeDocument/2006/math" xmlns:v="urn:schemas-microsoft-com:vml" xmlns:wp14="http://schemas.microsoft.com/office/word/2010/wordprocessingDrawing" xmlns:wp="http://schemas.openxmlformats.org/drawingml/2006/wordprocessingDrawing" xmlns:w10="urn:schemas-microsoft-com:office:word" xmlns:w="http://schemas.openxmlformats.org/wordprocessingml/2006/main" xmlns:w14="http://schemas.microsoft.com/office/word/2010/wordml" xmlns:w15="http://schemas.microsoft.com/office/word/2012/wordml" xmlns:w16cex="http://schemas.microsoft.com/office/word/2018/wordml/cex" xmlns:w16cid="http://schemas.microsoft.com/office/word/2016/wordml/cid" xmlns:w16="http://schemas.microsoft.com/office/word/2018/wordml" xmlns:w16du="http://schemas.microsoft.com/office/word/2023/wordml/word16du" xmlns:w16sdtdh="http://schemas.microsoft.com/office/word/2020/wordml/sdtdatahash" xmlns:w16sdtfl="http://schemas.microsoft.com/office/word/2024/wordml/sdtformatlock" xmlns:w16se="http://schemas.microsoft.com/office/word/2015/wordml/symex" xmlns:wpg="http://schemas.microsoft.com/office/word/2010/wordprocessingGroup" xmlns:wpi="http://schemas.microsoft.com/office/word/2010/wordprocessingInk" xmlns:wne="http://schemas.microsoft.com/office/word/2006/wordml" xmlns:wps="http://schemas.microsoft.com/office/word/2010/wordprocessingShape" mc:Ignorable="w14 w15 w16se w16cid w16 w16cex w16sdtdh w16sdtfl w16du wp14">
+<w:footnotes xmlns:wpc="http://schemas.microsoft.com/office/word/2010/wordprocessingCanvas" xmlns:cx="http://schemas.microsoft.com/office/drawing/2014/chartex" xmlns:cx1="http://schemas.microsoft.com/office/drawing/2015/9/8/chartex" xmlns:cx2="http://schemas.microsoft.com/office/drawing/2015/10/21/chartex" xmlns:cx3="http://schemas.microsoft.com/office/drawing/2016/5/9/chartex" xmlns:cx4="http://schemas.microsoft.com/office/drawing/2016/5/10/chartex" xmlns:cx5="http://schemas.microsoft.com/office/drawing/2016/5/11/chartex" xmlns:cx6="http://schemas.microsoft.com/office/drawing/2016/5/12/chartex" xmlns:cx7="http://schemas.microsoft.com/office/drawing/2016/5/13/chartex" xmlns:cx8="http://schemas.microsoft.com/office/drawing/2016/5/14/chartex" xmlns:mc="http://schemas.openxmlformats.org/markup-compatibility/2006" xmlns:aink="http://schemas.microsoft.com/office/drawing/2016/ink" xmlns:am3d="http://schemas.microsoft.com/office/drawing/2017/model3d" xmlns:o="urn:schemas-microsoft-com:office:office" xmlns:r="http://schemas.openxmlformats.org/officeDocument/2006/relationships" xmlns:m="http://schemas.openxmlformats.org/officeDocument/2006/math" xmlns:v="urn:schemas-microsoft-com:vml" xmlns:wp14="http://schemas.microsoft.com/office/word/2010/wordprocessingDrawing" xmlns:wp="http://schemas.openxmlformats.org/drawingml/2006/wordprocessingDrawing" xmlns:w10="urn:schemas-microsoft-com:office:word" xmlns:w="http://schemas.openxmlformats.org/wordprocessingml/2006/main" xmlns:w14="http://schemas.microsoft.com/office/word/2010/wordml" xmlns:w15="http://schemas.microsoft.com/office/word/2012/wordml" xmlns:w16cex="http://schemas.microsoft.com/office/word/2018/wordml/cex" xmlns:w16cid="http://schemas.microsoft.com/office/word/2016/wordml/cid" xmlns:w16="http://schemas.microsoft.com/office/word/2018/wordml" xmlns:w16sdtdh="http://schemas.microsoft.com/office/word/2020/wordml/sdtdatahash" xmlns:w16se="http://schemas.microsoft.com/office/word/2015/wordml/symex" xmlns:wpg="http://schemas.microsoft.com/office/word/2010/wordprocessingGroup" xmlns:wpi="http://schemas.microsoft.com/office/word/2010/wordprocessingInk" xmlns:wne="http://schemas.microsoft.com/office/word/2006/wordml" xmlns:wps="http://schemas.microsoft.com/office/word/2010/wordprocessingShape" mc:Ignorable="w14 w15 w16se w16cid w16 w16cex w16sdtdh wp14">
   <w:footnote w:type="separator" w:id="-1">
     <w:p>
       <w:pPr>
@@ -1432,7 +2354,7 @@
 </file>
 
 <file path=word/header1.xml><?xml version="1.0" encoding="utf-8"?>
-<w:hdr xmlns:wpc="http://schemas.microsoft.com/office/word/2010/wordprocessingCanvas" xmlns:cx="http://schemas.microsoft.com/office/drawing/2014/chartex" xmlns:cx1="http://schemas.microsoft.com/office/drawing/2015/9/8/chartex" xmlns:cx2="http://schemas.microsoft.com/office/drawing/2015/10/21/chartex" xmlns:cx3="http://schemas.microsoft.com/office/drawing/2016/5/9/chartex" xmlns:cx4="http://schemas.microsoft.com/office/drawing/2016/5/10/chartex" xmlns:cx5="http://schemas.microsoft.com/office/drawing/2016/5/11/chartex" xmlns:cx6="http://schemas.microsoft.com/office/drawing/2016/5/12/chartex" xmlns:cx7="http://schemas.microsoft.com/office/drawing/2016/5/13/chartex" xmlns:cx8="http://schemas.microsoft.com/office/drawing/2016/5/14/chartex" xmlns:mc="http://schemas.openxmlformats.org/markup-compatibility/2006" xmlns:aink="http://schemas.microsoft.com/office/drawing/2016/ink" xmlns:am3d="http://schemas.microsoft.com/office/drawing/2017/model3d" xmlns:o="urn:schemas-microsoft-com:office:office" xmlns:oel="http://schemas.microsoft.com/office/2019/extlst" xmlns:r="http://schemas.openxmlformats.org/officeDocument/2006/relationships" xmlns:m="http://schemas.openxmlformats.org/officeDocument/2006/math" xmlns:v="urn:schemas-microsoft-com:vml" xmlns:wp14="http://schemas.microsoft.com/office/word/2010/wordprocessingDrawing" xmlns:wp="http://schemas.openxmlformats.org/drawingml/2006/wordprocessingDrawing" xmlns:w10="urn:schemas-microsoft-com:office:word" xmlns:w="http://schemas.openxmlformats.org/wordprocessingml/2006/main" xmlns:w14="http://schemas.microsoft.com/office/word/2010/wordml" xmlns:w15="http://schemas.microsoft.com/office/word/2012/wordml" xmlns:w16cex="http://schemas.microsoft.com/office/word/2018/wordml/cex" xmlns:w16cid="http://schemas.microsoft.com/office/word/2016/wordml/cid" xmlns:w16="http://schemas.microsoft.com/office/word/2018/wordml" xmlns:w16du="http://schemas.microsoft.com/office/word/2023/wordml/word16du" xmlns:w16sdtdh="http://schemas.microsoft.com/office/word/2020/wordml/sdtdatahash" xmlns:w16sdtfl="http://schemas.microsoft.com/office/word/2024/wordml/sdtformatlock" xmlns:w16se="http://schemas.microsoft.com/office/word/2015/wordml/symex" xmlns:wpg="http://schemas.microsoft.com/office/word/2010/wordprocessingGroup" xmlns:wpi="http://schemas.microsoft.com/office/word/2010/wordprocessingInk" xmlns:wne="http://schemas.microsoft.com/office/word/2006/wordml" xmlns:wps="http://schemas.microsoft.com/office/word/2010/wordprocessingShape" mc:Ignorable="w14 w15 w16se w16cid w16 w16cex w16sdtdh w16sdtfl w16du wp14">
+<w:hdr xmlns:wpc="http://schemas.microsoft.com/office/word/2010/wordprocessingCanvas" xmlns:cx="http://schemas.microsoft.com/office/drawing/2014/chartex" xmlns:cx1="http://schemas.microsoft.com/office/drawing/2015/9/8/chartex" xmlns:cx2="http://schemas.microsoft.com/office/drawing/2015/10/21/chartex" xmlns:cx3="http://schemas.microsoft.com/office/drawing/2016/5/9/chartex" xmlns:cx4="http://schemas.microsoft.com/office/drawing/2016/5/10/chartex" xmlns:cx5="http://schemas.microsoft.com/office/drawing/2016/5/11/chartex" xmlns:cx6="http://schemas.microsoft.com/office/drawing/2016/5/12/chartex" xmlns:cx7="http://schemas.microsoft.com/office/drawing/2016/5/13/chartex" xmlns:cx8="http://schemas.microsoft.com/office/drawing/2016/5/14/chartex" xmlns:mc="http://schemas.openxmlformats.org/markup-compatibility/2006" xmlns:aink="http://schemas.microsoft.com/office/drawing/2016/ink" xmlns:am3d="http://schemas.microsoft.com/office/drawing/2017/model3d" xmlns:o="urn:schemas-microsoft-com:office:office" xmlns:r="http://schemas.openxmlformats.org/officeDocument/2006/relationships" xmlns:m="http://schemas.openxmlformats.org/officeDocument/2006/math" xmlns:v="urn:schemas-microsoft-com:vml" xmlns:wp14="http://schemas.microsoft.com/office/word/2010/wordprocessingDrawing" xmlns:wp="http://schemas.openxmlformats.org/drawingml/2006/wordprocessingDrawing" xmlns:w10="urn:schemas-microsoft-com:office:word" xmlns:w="http://schemas.openxmlformats.org/wordprocessingml/2006/main" xmlns:w14="http://schemas.microsoft.com/office/word/2010/wordml" xmlns:w15="http://schemas.microsoft.com/office/word/2012/wordml" xmlns:w16cex="http://schemas.microsoft.com/office/word/2018/wordml/cex" xmlns:w16cid="http://schemas.microsoft.com/office/word/2016/wordml/cid" xmlns:w16="http://schemas.microsoft.com/office/word/2018/wordml" xmlns:w16sdtdh="http://schemas.microsoft.com/office/word/2020/wordml/sdtdatahash" xmlns:w16se="http://schemas.microsoft.com/office/word/2015/wordml/symex" xmlns:wpg="http://schemas.microsoft.com/office/word/2010/wordprocessingGroup" xmlns:wpi="http://schemas.microsoft.com/office/word/2010/wordprocessingInk" xmlns:wne="http://schemas.microsoft.com/office/word/2006/wordml" xmlns:wps="http://schemas.microsoft.com/office/word/2010/wordprocessingShape" mc:Ignorable="w14 w15 w16se w16cid w16 w16cex w16sdtdh wp14">
   <w:p>
     <w:pPr>
       <w:tabs>
@@ -1523,7 +2445,7 @@
             </wp:anchor>
           </w:drawing>
         </mc:Choice>
-        <mc:Fallback>
+        <mc:Fallback xmlns:w16sdtfl="http://schemas.microsoft.com/office/word/2024/wordml/sdtformatlock" xmlns:w16du="http://schemas.microsoft.com/office/word/2023/wordml/word16du" xmlns:oel="http://schemas.microsoft.com/office/2019/extlst">
           <w:pict>
             <v:rect w14:anchorId="304B4679" id="Téglalap 9" o:spid="_x0000_s1026" style="position:absolute;margin-left:471.4pt;margin-top:-115.6pt;width:133.95pt;height:190.65pt;rotation:-2528204fd;z-index:251661312;visibility:visible;mso-wrap-style:square;mso-width-percent:0;mso-height-percent:0;mso-wrap-distance-left:9pt;mso-wrap-distance-top:0;mso-wrap-distance-right:9pt;mso-wrap-distance-bottom:0;mso-position-horizontal:absolute;mso-position-horizontal-relative:text;mso-position-vertical:absolute;mso-position-vertical-relative:text;mso-width-percent:0;mso-height-percent:0;mso-width-relative:margin;mso-height-relative:margin;v-text-anchor:middle" o:gfxdata="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" fillcolor="#8eaadb [1940]" strokecolor="white [3212]" strokeweight="1pt"/>
           </w:pict>
@@ -1686,7 +2608,7 @@
 </file>
 
 <file path=word/numbering.xml><?xml version="1.0" encoding="utf-8"?>
-<w:numbering xmlns:wpc="http://schemas.microsoft.com/office/word/2010/wordprocessingCanvas" xmlns:cx="http://schemas.microsoft.com/office/drawing/2014/chartex" xmlns:cx1="http://schemas.microsoft.com/office/drawing/2015/9/8/chartex" xmlns:cx2="http://schemas.microsoft.com/office/drawing/2015/10/21/chartex" xmlns:cx3="http://schemas.microsoft.com/office/drawing/2016/5/9/chartex" xmlns:cx4="http://schemas.microsoft.com/office/drawing/2016/5/10/chartex" xmlns:cx5="http://schemas.microsoft.com/office/drawing/2016/5/11/chartex" xmlns:cx6="http://schemas.microsoft.com/office/drawing/2016/5/12/chartex" xmlns:cx7="http://schemas.microsoft.com/office/drawing/2016/5/13/chartex" xmlns:cx8="http://schemas.microsoft.com/office/drawing/2016/5/14/chartex" xmlns:mc="http://schemas.openxmlformats.org/markup-compatibility/2006" xmlns:aink="http://schemas.microsoft.com/office/drawing/2016/ink" xmlns:am3d="http://schemas.microsoft.com/office/drawing/2017/model3d" xmlns:o="urn:schemas-microsoft-com:office:office" xmlns:oel="http://schemas.microsoft.com/office/2019/extlst" xmlns:r="http://schemas.openxmlformats.org/officeDocument/2006/relationships" xmlns:m="http://schemas.openxmlformats.org/officeDocument/2006/math" xmlns:v="urn:schemas-microsoft-com:vml" xmlns:wp14="http://schemas.microsoft.com/office/word/2010/wordprocessingDrawing" xmlns:wp="http://schemas.openxmlformats.org/drawingml/2006/wordprocessingDrawing" xmlns:w10="urn:schemas-microsoft-com:office:word" xmlns:w="http://schemas.openxmlformats.org/wordprocessingml/2006/main" xmlns:w14="http://schemas.microsoft.com/office/word/2010/wordml" xmlns:w15="http://schemas.microsoft.com/office/word/2012/wordml" xmlns:w16cex="http://schemas.microsoft.com/office/word/2018/wordml/cex" xmlns:w16cid="http://schemas.microsoft.com/office/word/2016/wordml/cid" xmlns:w16="http://schemas.microsoft.com/office/word/2018/wordml" xmlns:w16du="http://schemas.microsoft.com/office/word/2023/wordml/word16du" xmlns:w16sdtdh="http://schemas.microsoft.com/office/word/2020/wordml/sdtdatahash" xmlns:w16sdtfl="http://schemas.microsoft.com/office/word/2024/wordml/sdtformatlock" xmlns:w16se="http://schemas.microsoft.com/office/word/2015/wordml/symex" xmlns:wpg="http://schemas.microsoft.com/office/word/2010/wordprocessingGroup" xmlns:wpi="http://schemas.microsoft.com/office/word/2010/wordprocessingInk" xmlns:wne="http://schemas.microsoft.com/office/word/2006/wordml" xmlns:wps="http://schemas.microsoft.com/office/word/2010/wordprocessingShape" mc:Ignorable="w14 w15 w16se w16cid w16 w16cex w16sdtdh w16sdtfl w16du wp14">
+<w:numbering xmlns:wpc="http://schemas.microsoft.com/office/word/2010/wordprocessingCanvas" xmlns:cx="http://schemas.microsoft.com/office/drawing/2014/chartex" xmlns:cx1="http://schemas.microsoft.com/office/drawing/2015/9/8/chartex" xmlns:cx2="http://schemas.microsoft.com/office/drawing/2015/10/21/chartex" xmlns:cx3="http://schemas.microsoft.com/office/drawing/2016/5/9/chartex" xmlns:cx4="http://schemas.microsoft.com/office/drawing/2016/5/10/chartex" xmlns:cx5="http://schemas.microsoft.com/office/drawing/2016/5/11/chartex" xmlns:cx6="http://schemas.microsoft.com/office/drawing/2016/5/12/chartex" xmlns:cx7="http://schemas.microsoft.com/office/drawing/2016/5/13/chartex" xmlns:cx8="http://schemas.microsoft.com/office/drawing/2016/5/14/chartex" xmlns:mc="http://schemas.openxmlformats.org/markup-compatibility/2006" xmlns:aink="http://schemas.microsoft.com/office/drawing/2016/ink" xmlns:am3d="http://schemas.microsoft.com/office/drawing/2017/model3d" xmlns:o="urn:schemas-microsoft-com:office:office" xmlns:r="http://schemas.openxmlformats.org/officeDocument/2006/relationships" xmlns:m="http://schemas.openxmlformats.org/officeDocument/2006/math" xmlns:v="urn:schemas-microsoft-com:vml" xmlns:wp14="http://schemas.microsoft.com/office/word/2010/wordprocessingDrawing" xmlns:wp="http://schemas.openxmlformats.org/drawingml/2006/wordprocessingDrawing" xmlns:w10="urn:schemas-microsoft-com:office:word" xmlns:w="http://schemas.openxmlformats.org/wordprocessingml/2006/main" xmlns:w14="http://schemas.microsoft.com/office/word/2010/wordml" xmlns:w15="http://schemas.microsoft.com/office/word/2012/wordml" xmlns:w16cex="http://schemas.microsoft.com/office/word/2018/wordml/cex" xmlns:w16cid="http://schemas.microsoft.com/office/word/2016/wordml/cid" xmlns:w16="http://schemas.microsoft.com/office/word/2018/wordml" xmlns:w16sdtdh="http://schemas.microsoft.com/office/word/2020/wordml/sdtdatahash" xmlns:w16se="http://schemas.microsoft.com/office/word/2015/wordml/symex" xmlns:wpg="http://schemas.microsoft.com/office/word/2010/wordprocessingGroup" xmlns:wpi="http://schemas.microsoft.com/office/word/2010/wordprocessingInk" xmlns:wne="http://schemas.microsoft.com/office/word/2006/wordml" xmlns:wps="http://schemas.microsoft.com/office/word/2010/wordprocessingShape" mc:Ignorable="w14 w15 w16se w16cid w16 w16cex w16sdtdh wp14">
   <w:abstractNum w:abstractNumId="0" w15:restartNumberingAfterBreak="0">
     <w:nsid w:val="03C675BA"/>
     <w:multiLevelType w:val="hybridMultilevel"/>
@@ -2293,6 +3215,92 @@
     </w:lvl>
   </w:abstractNum>
   <w:abstractNum w:abstractNumId="7" w15:restartNumberingAfterBreak="0">
+    <w:nsid w:val="245A51A1"/>
+    <w:multiLevelType w:val="hybridMultilevel"/>
+    <w:tmpl w:val="B0BA4974"/>
+    <w:lvl w:ilvl="0" w:tplc="040E0019">
+      <w:start w:val="1"/>
+      <w:numFmt w:val="lowerLetter"/>
+      <w:lvlText w:val="%1."/>
+      <w:lvlJc w:val="left"/>
+      <w:pPr>
+        <w:ind w:left="720" w:hanging="360"/>
+      </w:pPr>
+    </w:lvl>
+    <w:lvl w:ilvl="1" w:tplc="040E0019" w:tentative="1">
+      <w:start w:val="1"/>
+      <w:numFmt w:val="lowerLetter"/>
+      <w:lvlText w:val="%2."/>
+      <w:lvlJc w:val="left"/>
+      <w:pPr>
+        <w:ind w:left="1440" w:hanging="360"/>
+      </w:pPr>
+    </w:lvl>
+    <w:lvl w:ilvl="2" w:tplc="040E001B" w:tentative="1">
+      <w:start w:val="1"/>
+      <w:numFmt w:val="lowerRoman"/>
+      <w:lvlText w:val="%3."/>
+      <w:lvlJc w:val="right"/>
+      <w:pPr>
+        <w:ind w:left="2160" w:hanging="180"/>
+      </w:pPr>
+    </w:lvl>
+    <w:lvl w:ilvl="3" w:tplc="040E000F" w:tentative="1">
+      <w:start w:val="1"/>
+      <w:numFmt w:val="decimal"/>
+      <w:lvlText w:val="%4."/>
+      <w:lvlJc w:val="left"/>
+      <w:pPr>
+        <w:ind w:left="2880" w:hanging="360"/>
+      </w:pPr>
+    </w:lvl>
+    <w:lvl w:ilvl="4" w:tplc="040E0019" w:tentative="1">
+      <w:start w:val="1"/>
+      <w:numFmt w:val="lowerLetter"/>
+      <w:lvlText w:val="%5."/>
+      <w:lvlJc w:val="left"/>
+      <w:pPr>
+        <w:ind w:left="3600" w:hanging="360"/>
+      </w:pPr>
+    </w:lvl>
+    <w:lvl w:ilvl="5" w:tplc="040E001B" w:tentative="1">
+      <w:start w:val="1"/>
+      <w:numFmt w:val="lowerRoman"/>
+      <w:lvlText w:val="%6."/>
+      <w:lvlJc w:val="right"/>
+      <w:pPr>
+        <w:ind w:left="4320" w:hanging="180"/>
+      </w:pPr>
+    </w:lvl>
+    <w:lvl w:ilvl="6" w:tplc="040E000F" w:tentative="1">
+      <w:start w:val="1"/>
+      <w:numFmt w:val="decimal"/>
+      <w:lvlText w:val="%7."/>
+      <w:lvlJc w:val="left"/>
+      <w:pPr>
+        <w:ind w:left="5040" w:hanging="360"/>
+      </w:pPr>
+    </w:lvl>
+    <w:lvl w:ilvl="7" w:tplc="040E0019" w:tentative="1">
+      <w:start w:val="1"/>
+      <w:numFmt w:val="lowerLetter"/>
+      <w:lvlText w:val="%8."/>
+      <w:lvlJc w:val="left"/>
+      <w:pPr>
+        <w:ind w:left="5760" w:hanging="360"/>
+      </w:pPr>
+    </w:lvl>
+    <w:lvl w:ilvl="8" w:tplc="040E001B" w:tentative="1">
+      <w:start w:val="1"/>
+      <w:numFmt w:val="lowerRoman"/>
+      <w:lvlText w:val="%9."/>
+      <w:lvlJc w:val="right"/>
+      <w:pPr>
+        <w:ind w:left="6480" w:hanging="180"/>
+      </w:pPr>
+    </w:lvl>
+  </w:abstractNum>
+  <w:abstractNum w:abstractNumId="8" w15:restartNumberingAfterBreak="0">
     <w:nsid w:val="2B0B79BB"/>
     <w:multiLevelType w:val="hybridMultilevel"/>
     <w:tmpl w:val="B6FEBCFE"/>
@@ -2378,7 +3386,93 @@
       </w:pPr>
     </w:lvl>
   </w:abstractNum>
-  <w:abstractNum w:abstractNumId="8" w15:restartNumberingAfterBreak="0">
+  <w:abstractNum w:abstractNumId="9" w15:restartNumberingAfterBreak="0">
+    <w:nsid w:val="314D0889"/>
+    <w:multiLevelType w:val="hybridMultilevel"/>
+    <w:tmpl w:val="73D414C2"/>
+    <w:lvl w:ilvl="0" w:tplc="040E000F">
+      <w:start w:val="1"/>
+      <w:numFmt w:val="decimal"/>
+      <w:lvlText w:val="%1."/>
+      <w:lvlJc w:val="left"/>
+      <w:pPr>
+        <w:ind w:left="720" w:hanging="360"/>
+      </w:pPr>
+    </w:lvl>
+    <w:lvl w:ilvl="1" w:tplc="040E0019">
+      <w:start w:val="1"/>
+      <w:numFmt w:val="lowerLetter"/>
+      <w:lvlText w:val="%2."/>
+      <w:lvlJc w:val="left"/>
+      <w:pPr>
+        <w:ind w:left="1440" w:hanging="360"/>
+      </w:pPr>
+    </w:lvl>
+    <w:lvl w:ilvl="2" w:tplc="040E001B" w:tentative="1">
+      <w:start w:val="1"/>
+      <w:numFmt w:val="lowerRoman"/>
+      <w:lvlText w:val="%3."/>
+      <w:lvlJc w:val="right"/>
+      <w:pPr>
+        <w:ind w:left="2160" w:hanging="180"/>
+      </w:pPr>
+    </w:lvl>
+    <w:lvl w:ilvl="3" w:tplc="040E000F" w:tentative="1">
+      <w:start w:val="1"/>
+      <w:numFmt w:val="decimal"/>
+      <w:lvlText w:val="%4."/>
+      <w:lvlJc w:val="left"/>
+      <w:pPr>
+        <w:ind w:left="2880" w:hanging="360"/>
+      </w:pPr>
+    </w:lvl>
+    <w:lvl w:ilvl="4" w:tplc="040E0019" w:tentative="1">
+      <w:start w:val="1"/>
+      <w:numFmt w:val="lowerLetter"/>
+      <w:lvlText w:val="%5."/>
+      <w:lvlJc w:val="left"/>
+      <w:pPr>
+        <w:ind w:left="3600" w:hanging="360"/>
+      </w:pPr>
+    </w:lvl>
+    <w:lvl w:ilvl="5" w:tplc="040E001B" w:tentative="1">
+      <w:start w:val="1"/>
+      <w:numFmt w:val="lowerRoman"/>
+      <w:lvlText w:val="%6."/>
+      <w:lvlJc w:val="right"/>
+      <w:pPr>
+        <w:ind w:left="4320" w:hanging="180"/>
+      </w:pPr>
+    </w:lvl>
+    <w:lvl w:ilvl="6" w:tplc="040E000F" w:tentative="1">
+      <w:start w:val="1"/>
+      <w:numFmt w:val="decimal"/>
+      <w:lvlText w:val="%7."/>
+      <w:lvlJc w:val="left"/>
+      <w:pPr>
+        <w:ind w:left="5040" w:hanging="360"/>
+      </w:pPr>
+    </w:lvl>
+    <w:lvl w:ilvl="7" w:tplc="040E0019" w:tentative="1">
+      <w:start w:val="1"/>
+      <w:numFmt w:val="lowerLetter"/>
+      <w:lvlText w:val="%8."/>
+      <w:lvlJc w:val="left"/>
+      <w:pPr>
+        <w:ind w:left="5760" w:hanging="360"/>
+      </w:pPr>
+    </w:lvl>
+    <w:lvl w:ilvl="8" w:tplc="040E001B" w:tentative="1">
+      <w:start w:val="1"/>
+      <w:numFmt w:val="lowerRoman"/>
+      <w:lvlText w:val="%9."/>
+      <w:lvlJc w:val="right"/>
+      <w:pPr>
+        <w:ind w:left="6480" w:hanging="180"/>
+      </w:pPr>
+    </w:lvl>
+  </w:abstractNum>
+  <w:abstractNum w:abstractNumId="10" w15:restartNumberingAfterBreak="0">
     <w:nsid w:val="35F943F0"/>
     <w:multiLevelType w:val="hybridMultilevel"/>
     <w:tmpl w:val="299E004E"/>
@@ -2464,7 +3558,7 @@
       </w:pPr>
     </w:lvl>
   </w:abstractNum>
-  <w:abstractNum w:abstractNumId="9" w15:restartNumberingAfterBreak="0">
+  <w:abstractNum w:abstractNumId="11" w15:restartNumberingAfterBreak="0">
     <w:nsid w:val="3BBB2CE9"/>
     <w:multiLevelType w:val="hybridMultilevel"/>
     <w:tmpl w:val="CE146242"/>
@@ -2550,7 +3644,7 @@
       </w:pPr>
     </w:lvl>
   </w:abstractNum>
-  <w:abstractNum w:abstractNumId="10" w15:restartNumberingAfterBreak="0">
+  <w:abstractNum w:abstractNumId="12" w15:restartNumberingAfterBreak="0">
     <w:nsid w:val="3D09481E"/>
     <w:multiLevelType w:val="hybridMultilevel"/>
     <w:tmpl w:val="F77AC78A"/>
@@ -2636,7 +3730,96 @@
       </w:pPr>
     </w:lvl>
   </w:abstractNum>
-  <w:abstractNum w:abstractNumId="11" w15:restartNumberingAfterBreak="0">
+  <w:abstractNum w:abstractNumId="13" w15:restartNumberingAfterBreak="0">
+    <w:nsid w:val="464758A4"/>
+    <w:multiLevelType w:val="hybridMultilevel"/>
+    <w:tmpl w:val="9014BCBE"/>
+    <w:lvl w:ilvl="0" w:tplc="040E000F">
+      <w:start w:val="1"/>
+      <w:numFmt w:val="decimal"/>
+      <w:lvlText w:val="%1."/>
+      <w:lvlJc w:val="left"/>
+      <w:pPr>
+        <w:ind w:left="720" w:hanging="360"/>
+      </w:pPr>
+      <w:rPr>
+        <w:rFonts w:hint="default"/>
+      </w:rPr>
+    </w:lvl>
+    <w:lvl w:ilvl="1" w:tplc="040E0019">
+      <w:start w:val="1"/>
+      <w:numFmt w:val="lowerLetter"/>
+      <w:lvlText w:val="%2."/>
+      <w:lvlJc w:val="left"/>
+      <w:pPr>
+        <w:ind w:left="1440" w:hanging="360"/>
+      </w:pPr>
+    </w:lvl>
+    <w:lvl w:ilvl="2" w:tplc="040E001B">
+      <w:start w:val="1"/>
+      <w:numFmt w:val="lowerRoman"/>
+      <w:lvlText w:val="%3."/>
+      <w:lvlJc w:val="right"/>
+      <w:pPr>
+        <w:ind w:left="2160" w:hanging="180"/>
+      </w:pPr>
+    </w:lvl>
+    <w:lvl w:ilvl="3" w:tplc="040E000F" w:tentative="1">
+      <w:start w:val="1"/>
+      <w:numFmt w:val="decimal"/>
+      <w:lvlText w:val="%4."/>
+      <w:lvlJc w:val="left"/>
+      <w:pPr>
+        <w:ind w:left="2880" w:hanging="360"/>
+      </w:pPr>
+    </w:lvl>
+    <w:lvl w:ilvl="4" w:tplc="040E0019" w:tentative="1">
+      <w:start w:val="1"/>
+      <w:numFmt w:val="lowerLetter"/>
+      <w:lvlText w:val="%5."/>
+      <w:lvlJc w:val="left"/>
+      <w:pPr>
+        <w:ind w:left="3600" w:hanging="360"/>
+      </w:pPr>
+    </w:lvl>
+    <w:lvl w:ilvl="5" w:tplc="040E001B" w:tentative="1">
+      <w:start w:val="1"/>
+      <w:numFmt w:val="lowerRoman"/>
+      <w:lvlText w:val="%6."/>
+      <w:lvlJc w:val="right"/>
+      <w:pPr>
+        <w:ind w:left="4320" w:hanging="180"/>
+      </w:pPr>
+    </w:lvl>
+    <w:lvl w:ilvl="6" w:tplc="040E000F" w:tentative="1">
+      <w:start w:val="1"/>
+      <w:numFmt w:val="decimal"/>
+      <w:lvlText w:val="%7."/>
+      <w:lvlJc w:val="left"/>
+      <w:pPr>
+        <w:ind w:left="5040" w:hanging="360"/>
+      </w:pPr>
+    </w:lvl>
+    <w:lvl w:ilvl="7" w:tplc="040E0019" w:tentative="1">
+      <w:start w:val="1"/>
+      <w:numFmt w:val="lowerLetter"/>
+      <w:lvlText w:val="%8."/>
+      <w:lvlJc w:val="left"/>
+      <w:pPr>
+        <w:ind w:left="5760" w:hanging="360"/>
+      </w:pPr>
+    </w:lvl>
+    <w:lvl w:ilvl="8" w:tplc="040E001B" w:tentative="1">
+      <w:start w:val="1"/>
+      <w:numFmt w:val="lowerRoman"/>
+      <w:lvlText w:val="%9."/>
+      <w:lvlJc w:val="right"/>
+      <w:pPr>
+        <w:ind w:left="6480" w:hanging="180"/>
+      </w:pPr>
+    </w:lvl>
+  </w:abstractNum>
+  <w:abstractNum w:abstractNumId="14" w15:restartNumberingAfterBreak="0">
     <w:nsid w:val="4D2E279C"/>
     <w:multiLevelType w:val="hybridMultilevel"/>
     <w:tmpl w:val="971CAA5E"/>
@@ -2722,7 +3905,7 @@
       </w:pPr>
     </w:lvl>
   </w:abstractNum>
-  <w:abstractNum w:abstractNumId="12" w15:restartNumberingAfterBreak="0">
+  <w:abstractNum w:abstractNumId="15" w15:restartNumberingAfterBreak="0">
     <w:nsid w:val="52F7156A"/>
     <w:multiLevelType w:val="hybridMultilevel"/>
     <w:tmpl w:val="7FE6140E"/>
@@ -2808,7 +3991,7 @@
       </w:pPr>
     </w:lvl>
   </w:abstractNum>
-  <w:abstractNum w:abstractNumId="13" w15:restartNumberingAfterBreak="0">
+  <w:abstractNum w:abstractNumId="16" w15:restartNumberingAfterBreak="0">
     <w:nsid w:val="54562DEC"/>
     <w:multiLevelType w:val="hybridMultilevel"/>
     <w:tmpl w:val="05B67E32"/>
@@ -2922,7 +4105,7 @@
       </w:rPr>
     </w:lvl>
   </w:abstractNum>
-  <w:abstractNum w:abstractNumId="14" w15:restartNumberingAfterBreak="0">
+  <w:abstractNum w:abstractNumId="17" w15:restartNumberingAfterBreak="0">
     <w:nsid w:val="60126E16"/>
     <w:multiLevelType w:val="hybridMultilevel"/>
     <w:tmpl w:val="54DA825E"/>
@@ -3008,7 +4191,7 @@
       </w:pPr>
     </w:lvl>
   </w:abstractNum>
-  <w:abstractNum w:abstractNumId="15" w15:restartNumberingAfterBreak="0">
+  <w:abstractNum w:abstractNumId="18" w15:restartNumberingAfterBreak="0">
     <w:nsid w:val="609D1FE7"/>
     <w:multiLevelType w:val="hybridMultilevel"/>
     <w:tmpl w:val="1B0AA568"/>
@@ -3095,7 +4278,7 @@
       </w:pPr>
     </w:lvl>
   </w:abstractNum>
-  <w:abstractNum w:abstractNumId="16" w15:restartNumberingAfterBreak="0">
+  <w:abstractNum w:abstractNumId="19" w15:restartNumberingAfterBreak="0">
     <w:nsid w:val="70DB6429"/>
     <w:multiLevelType w:val="hybridMultilevel"/>
     <w:tmpl w:val="A6AECD5E"/>
@@ -3181,7 +4364,7 @@
       </w:pPr>
     </w:lvl>
   </w:abstractNum>
-  <w:abstractNum w:abstractNumId="17" w15:restartNumberingAfterBreak="0">
+  <w:abstractNum w:abstractNumId="20" w15:restartNumberingAfterBreak="0">
     <w:nsid w:val="7BE56039"/>
     <w:multiLevelType w:val="hybridMultilevel"/>
     <w:tmpl w:val="68064AF0"/>
@@ -3267,7 +4450,7 @@
       </w:pPr>
     </w:lvl>
   </w:abstractNum>
-  <w:abstractNum w:abstractNumId="18" w15:restartNumberingAfterBreak="0">
+  <w:abstractNum w:abstractNumId="21" w15:restartNumberingAfterBreak="0">
     <w:nsid w:val="7F762639"/>
     <w:multiLevelType w:val="hybridMultilevel"/>
     <w:tmpl w:val="5420D2E0"/>
@@ -3353,68 +4536,77 @@
       </w:pPr>
     </w:lvl>
   </w:abstractNum>
-  <w:num w:numId="1" w16cid:durableId="1028339832">
-    <w:abstractNumId w:val="13"/>
+  <w:num w:numId="1">
+    <w:abstractNumId w:val="16"/>
   </w:num>
-  <w:num w:numId="2" w16cid:durableId="427122347">
+  <w:num w:numId="2">
+    <w:abstractNumId w:val="18"/>
+  </w:num>
+  <w:num w:numId="3">
+    <w:abstractNumId w:val="20"/>
+  </w:num>
+  <w:num w:numId="4">
+    <w:abstractNumId w:val="8"/>
+  </w:num>
+  <w:num w:numId="5">
+    <w:abstractNumId w:val="21"/>
+  </w:num>
+  <w:num w:numId="6">
+    <w:abstractNumId w:val="17"/>
+  </w:num>
+  <w:num w:numId="7">
+    <w:abstractNumId w:val="5"/>
+  </w:num>
+  <w:num w:numId="8">
+    <w:abstractNumId w:val="11"/>
+  </w:num>
+  <w:num w:numId="9">
+    <w:abstractNumId w:val="12"/>
+  </w:num>
+  <w:num w:numId="10">
+    <w:abstractNumId w:val="1"/>
+  </w:num>
+  <w:num w:numId="11">
+    <w:abstractNumId w:val="10"/>
+  </w:num>
+  <w:num w:numId="12">
+    <w:abstractNumId w:val="6"/>
+  </w:num>
+  <w:num w:numId="13">
+    <w:abstractNumId w:val="0"/>
+  </w:num>
+  <w:num w:numId="14">
+    <w:abstractNumId w:val="2"/>
+  </w:num>
+  <w:num w:numId="15">
+    <w:abstractNumId w:val="3"/>
+  </w:num>
+  <w:num w:numId="16">
     <w:abstractNumId w:val="15"/>
   </w:num>
-  <w:num w:numId="3" w16cid:durableId="841895872">
-    <w:abstractNumId w:val="17"/>
+  <w:num w:numId="17">
+    <w:abstractNumId w:val="4"/>
   </w:num>
-  <w:num w:numId="4" w16cid:durableId="1700542878">
+  <w:num w:numId="18">
+    <w:abstractNumId w:val="19"/>
+  </w:num>
+  <w:num w:numId="19">
+    <w:abstractNumId w:val="14"/>
+  </w:num>
+  <w:num w:numId="20">
+    <w:abstractNumId w:val="9"/>
+  </w:num>
+  <w:num w:numId="21">
     <w:abstractNumId w:val="7"/>
   </w:num>
-  <w:num w:numId="5" w16cid:durableId="1267619105">
-    <w:abstractNumId w:val="18"/>
-  </w:num>
-  <w:num w:numId="6" w16cid:durableId="121778380">
-    <w:abstractNumId w:val="14"/>
-  </w:num>
-  <w:num w:numId="7" w16cid:durableId="1521158433">
-    <w:abstractNumId w:val="5"/>
-  </w:num>
-  <w:num w:numId="8" w16cid:durableId="2020113663">
-    <w:abstractNumId w:val="9"/>
-  </w:num>
-  <w:num w:numId="9" w16cid:durableId="659427703">
-    <w:abstractNumId w:val="10"/>
-  </w:num>
-  <w:num w:numId="10" w16cid:durableId="1982881849">
-    <w:abstractNumId w:val="1"/>
-  </w:num>
-  <w:num w:numId="11" w16cid:durableId="2026902242">
-    <w:abstractNumId w:val="8"/>
-  </w:num>
-  <w:num w:numId="12" w16cid:durableId="1590774722">
-    <w:abstractNumId w:val="6"/>
-  </w:num>
-  <w:num w:numId="13" w16cid:durableId="1928995050">
-    <w:abstractNumId w:val="0"/>
-  </w:num>
-  <w:num w:numId="14" w16cid:durableId="160855911">
-    <w:abstractNumId w:val="2"/>
-  </w:num>
-  <w:num w:numId="15" w16cid:durableId="1894003287">
-    <w:abstractNumId w:val="3"/>
-  </w:num>
-  <w:num w:numId="16" w16cid:durableId="1572302283">
-    <w:abstractNumId w:val="12"/>
-  </w:num>
-  <w:num w:numId="17" w16cid:durableId="1859810632">
-    <w:abstractNumId w:val="4"/>
-  </w:num>
-  <w:num w:numId="18" w16cid:durableId="490147506">
-    <w:abstractNumId w:val="16"/>
-  </w:num>
-  <w:num w:numId="19" w16cid:durableId="496575641">
-    <w:abstractNumId w:val="11"/>
+  <w:num w:numId="22">
+    <w:abstractNumId w:val="13"/>
   </w:num>
 </w:numbering>
 </file>
 
 <file path=word/styles.xml><?xml version="1.0" encoding="utf-8"?>
-<w:styles xmlns:mc="http://schemas.openxmlformats.org/markup-compatibility/2006" xmlns:r="http://schemas.openxmlformats.org/officeDocument/2006/relationships" xmlns:w="http://schemas.openxmlformats.org/wordprocessingml/2006/main" xmlns:w14="http://schemas.microsoft.com/office/word/2010/wordml" xmlns:w15="http://schemas.microsoft.com/office/word/2012/wordml" xmlns:w16cex="http://schemas.microsoft.com/office/word/2018/wordml/cex" xmlns:w16cid="http://schemas.microsoft.com/office/word/2016/wordml/cid" xmlns:w16="http://schemas.microsoft.com/office/word/2018/wordml" xmlns:w16du="http://schemas.microsoft.com/office/word/2023/wordml/word16du" xmlns:w16sdtdh="http://schemas.microsoft.com/office/word/2020/wordml/sdtdatahash" xmlns:w16sdtfl="http://schemas.microsoft.com/office/word/2024/wordml/sdtformatlock" xmlns:w16se="http://schemas.microsoft.com/office/word/2015/wordml/symex" mc:Ignorable="w14 w15 w16se w16cid w16 w16cex w16sdtdh w16sdtfl w16du">
+<w:styles xmlns:mc="http://schemas.openxmlformats.org/markup-compatibility/2006" xmlns:r="http://schemas.openxmlformats.org/officeDocument/2006/relationships" xmlns:w="http://schemas.openxmlformats.org/wordprocessingml/2006/main" xmlns:w14="http://schemas.microsoft.com/office/word/2010/wordml" xmlns:w15="http://schemas.microsoft.com/office/word/2012/wordml" xmlns:w16cex="http://schemas.microsoft.com/office/word/2018/wordml/cex" xmlns:w16cid="http://schemas.microsoft.com/office/word/2016/wordml/cid" xmlns:w16="http://schemas.microsoft.com/office/word/2018/wordml" xmlns:w16sdtdh="http://schemas.microsoft.com/office/word/2020/wordml/sdtdatahash" xmlns:w16se="http://schemas.microsoft.com/office/word/2015/wordml/symex" mc:Ignorable="w14 w15 w16se w16cid w16 w16cex w16sdtdh">
   <w:docDefaults>
     <w:rPrDefault>
       <w:rPr>

</xml_diff>